<commit_message>
thêm hàm record import ghi thông tin nhập khẩu
</commit_message>
<xml_diff>
--- a/docs/nhat-ky-trien-khai.docx
+++ b/docs/nhat-ky-trien-khai.docx
@@ -65,7 +65,7 @@
         <w:t xml:space="preserve">Cập nhật lần cuối:</w:t>
       </w:r>
       <w:r>
-        <w:t xml:space="preserve"> 18/10/2026.</w:t>
+        <w:t xml:space="preserve"> 19/10/2026.</w:t>
       </w:r>
     </w:p>
     <w:p>
@@ -381,7 +381,7 @@
           </w:tcPr>
           <w:p>
             <w:r>
-              <w:t xml:space="preserve">3</w:t>
+              <w:t xml:space="preserve">4</w:t>
             </w:r>
           </w:p>
         </w:tc>
@@ -403,7 +403,7 @@
           </w:tcPr>
           <w:p>
             <w:r>
-              <w:t xml:space="preserve">T06, T07, T08 xong; T09 là việc tiếp theo</w:t>
+              <w:t xml:space="preserve">T06–T09 xong; T10 là việc tiếp theo</w:t>
             </w:r>
           </w:p>
         </w:tc>
@@ -951,7 +951,7 @@
                 <w:b/>
                 <w:bCs/>
               </w:rPr>
-              <w:t xml:space="preserve">3</w:t>
+              <w:t xml:space="preserve">4</w:t>
             </w:r>
           </w:p>
         </w:tc>
@@ -4872,6 +4872,821 @@
       </w:r>
       <w:r>
         <w:t xml:space="preserve">.</w:t>
+      </w:r>
+    </w:p>
+    <w:p>
+      <w:pPr>
+        <w:pStyle w:val="Heading3"/>
+      </w:pPr>
+      <w:r>
+        <w:t xml:space="preserve">T09: recordImport và event BatchImported (Bước 3)</w:t>
+      </w:r>
+    </w:p>
+    <w:tbl>
+      <w:tblPr>
+        <w:tblW w:type="dxa" w:w="9638"/>
+        <w:tblBorders>
+          <w:top w:val="single" w:color="auto" w:sz="4"/>
+          <w:left w:val="single" w:color="auto" w:sz="4"/>
+          <w:bottom w:val="single" w:color="auto" w:sz="4"/>
+          <w:right w:val="single" w:color="auto" w:sz="4"/>
+          <w:insideH w:val="single" w:color="auto" w:sz="4"/>
+          <w:insideV w:val="single" w:color="auto" w:sz="4"/>
+        </w:tblBorders>
+      </w:tblPr>
+      <w:tblGrid>
+        <w:gridCol w:w="2410"/>
+        <w:gridCol w:w="7228"/>
+      </w:tblGrid>
+      <w:tr>
+        <w:trPr>
+          <w:tblHeader/>
+        </w:trPr>
+        <w:tc>
+          <w:tcPr>
+            <w:tcW w:type="dxa" w:w="2410"/>
+            <w:tcBorders>
+              <w:top w:val="single" w:color="999999" w:sz="4"/>
+              <w:left w:val="single" w:color="999999" w:sz="4"/>
+              <w:bottom w:val="single" w:color="999999" w:sz="4"/>
+              <w:right w:val="single" w:color="999999" w:sz="4"/>
+            </w:tcBorders>
+            <w:shd w:fill="D9E2F3" w:color="auto" w:val="clear"/>
+            <w:tcMar>
+              <w:top w:type="dxa" w:w="60"/>
+              <w:left w:type="dxa" w:w="100"/>
+              <w:bottom w:type="dxa" w:w="60"/>
+              <w:right w:type="dxa" w:w="100"/>
+            </w:tcMar>
+          </w:tcPr>
+          <w:p>
+            <w:r>
+              <w:rPr>
+                <w:b/>
+                <w:bCs/>
+              </w:rPr>
+              <w:t xml:space="preserve">Mục</w:t>
+            </w:r>
+          </w:p>
+        </w:tc>
+        <w:tc>
+          <w:tcPr>
+            <w:tcW w:type="dxa" w:w="7228"/>
+            <w:tcBorders>
+              <w:top w:val="single" w:color="999999" w:sz="4"/>
+              <w:left w:val="single" w:color="999999" w:sz="4"/>
+              <w:bottom w:val="single" w:color="999999" w:sz="4"/>
+              <w:right w:val="single" w:color="999999" w:sz="4"/>
+            </w:tcBorders>
+            <w:shd w:fill="D9E2F3" w:color="auto" w:val="clear"/>
+            <w:tcMar>
+              <w:top w:type="dxa" w:w="60"/>
+              <w:left w:type="dxa" w:w="100"/>
+              <w:bottom w:type="dxa" w:w="60"/>
+              <w:right w:type="dxa" w:w="100"/>
+            </w:tcMar>
+          </w:tcPr>
+          <w:p>
+            <w:r>
+              <w:rPr>
+                <w:b/>
+                <w:bCs/>
+              </w:rPr>
+              <w:t xml:space="preserve">Nội dung</w:t>
+            </w:r>
+          </w:p>
+        </w:tc>
+      </w:tr>
+      <w:tr>
+        <w:trPr>
+          <w:tblHeader w:val="false"/>
+        </w:trPr>
+        <w:tc>
+          <w:tcPr>
+            <w:tcW w:type="dxa" w:w="2410"/>
+            <w:tcBorders>
+              <w:top w:val="single" w:color="999999" w:sz="4"/>
+              <w:left w:val="single" w:color="999999" w:sz="4"/>
+              <w:bottom w:val="single" w:color="999999" w:sz="4"/>
+              <w:right w:val="single" w:color="999999" w:sz="4"/>
+            </w:tcBorders>
+            <w:tcMar>
+              <w:top w:type="dxa" w:w="60"/>
+              <w:left w:type="dxa" w:w="100"/>
+              <w:bottom w:type="dxa" w:w="60"/>
+              <w:right w:type="dxa" w:w="100"/>
+            </w:tcMar>
+          </w:tcPr>
+          <w:p>
+            <w:r>
+              <w:t xml:space="preserve">Ngày</w:t>
+            </w:r>
+          </w:p>
+        </w:tc>
+        <w:tc>
+          <w:tcPr>
+            <w:tcW w:type="dxa" w:w="7228"/>
+            <w:tcBorders>
+              <w:top w:val="single" w:color="999999" w:sz="4"/>
+              <w:left w:val="single" w:color="999999" w:sz="4"/>
+              <w:bottom w:val="single" w:color="999999" w:sz="4"/>
+              <w:right w:val="single" w:color="999999" w:sz="4"/>
+            </w:tcBorders>
+            <w:tcMar>
+              <w:top w:type="dxa" w:w="60"/>
+              <w:left w:type="dxa" w:w="100"/>
+              <w:bottom w:type="dxa" w:w="60"/>
+              <w:right w:type="dxa" w:w="100"/>
+            </w:tcMar>
+          </w:tcPr>
+          <w:p>
+            <w:r>
+              <w:t xml:space="preserve">19/10/2026</w:t>
+            </w:r>
+          </w:p>
+        </w:tc>
+      </w:tr>
+      <w:tr>
+        <w:trPr>
+          <w:tblHeader w:val="false"/>
+        </w:trPr>
+        <w:tc>
+          <w:tcPr>
+            <w:tcW w:type="dxa" w:w="2410"/>
+            <w:tcBorders>
+              <w:top w:val="single" w:color="999999" w:sz="4"/>
+              <w:left w:val="single" w:color="999999" w:sz="4"/>
+              <w:bottom w:val="single" w:color="999999" w:sz="4"/>
+              <w:right w:val="single" w:color="999999" w:sz="4"/>
+            </w:tcBorders>
+            <w:tcMar>
+              <w:top w:type="dxa" w:w="60"/>
+              <w:left w:type="dxa" w:w="100"/>
+              <w:bottom w:type="dxa" w:w="60"/>
+              <w:right w:type="dxa" w:w="100"/>
+            </w:tcMar>
+          </w:tcPr>
+          <w:p>
+            <w:r>
+              <w:t xml:space="preserve">Người thực hiện</w:t>
+            </w:r>
+          </w:p>
+        </w:tc>
+        <w:tc>
+          <w:tcPr>
+            <w:tcW w:type="dxa" w:w="7228"/>
+            <w:tcBorders>
+              <w:top w:val="single" w:color="999999" w:sz="4"/>
+              <w:left w:val="single" w:color="999999" w:sz="4"/>
+              <w:bottom w:val="single" w:color="999999" w:sz="4"/>
+              <w:right w:val="single" w:color="999999" w:sz="4"/>
+            </w:tcBorders>
+            <w:tcMar>
+              <w:top w:type="dxa" w:w="60"/>
+              <w:left w:type="dxa" w:w="100"/>
+              <w:bottom w:type="dxa" w:w="60"/>
+              <w:right w:type="dxa" w:w="100"/>
+            </w:tcMar>
+          </w:tcPr>
+          <w:p>
+            <w:r>
+              <w:t xml:space="preserve">Nguyễn Nhật Huy (với hỗ trợ của Claude)</w:t>
+            </w:r>
+          </w:p>
+        </w:tc>
+      </w:tr>
+      <w:tr>
+        <w:trPr>
+          <w:tblHeader w:val="false"/>
+        </w:trPr>
+        <w:tc>
+          <w:tcPr>
+            <w:tcW w:type="dxa" w:w="2410"/>
+            <w:tcBorders>
+              <w:top w:val="single" w:color="999999" w:sz="4"/>
+              <w:left w:val="single" w:color="999999" w:sz="4"/>
+              <w:bottom w:val="single" w:color="999999" w:sz="4"/>
+              <w:right w:val="single" w:color="999999" w:sz="4"/>
+            </w:tcBorders>
+            <w:tcMar>
+              <w:top w:type="dxa" w:w="60"/>
+              <w:left w:type="dxa" w:w="100"/>
+              <w:bottom w:type="dxa" w:w="60"/>
+              <w:right w:type="dxa" w:w="100"/>
+            </w:tcMar>
+          </w:tcPr>
+          <w:p>
+            <w:r>
+              <w:t xml:space="preserve">Trạng thái</w:t>
+            </w:r>
+          </w:p>
+        </w:tc>
+        <w:tc>
+          <w:tcPr>
+            <w:tcW w:type="dxa" w:w="7228"/>
+            <w:tcBorders>
+              <w:top w:val="single" w:color="999999" w:sz="4"/>
+              <w:left w:val="single" w:color="999999" w:sz="4"/>
+              <w:bottom w:val="single" w:color="999999" w:sz="4"/>
+              <w:right w:val="single" w:color="999999" w:sz="4"/>
+            </w:tcBorders>
+            <w:tcMar>
+              <w:top w:type="dxa" w:w="60"/>
+              <w:left w:type="dxa" w:w="100"/>
+              <w:bottom w:type="dxa" w:w="60"/>
+              <w:right w:type="dxa" w:w="100"/>
+            </w:tcMar>
+          </w:tcPr>
+          <w:p>
+            <w:r>
+              <w:t xml:space="preserve">Xong</w:t>
+            </w:r>
+          </w:p>
+        </w:tc>
+      </w:tr>
+    </w:tbl>
+    <w:p>
+      <w:pPr>
+        <w:spacing w:after="120"/>
+      </w:pPr>
+    </w:p>
+    <w:p>
+      <w:pPr>
+        <w:spacing w:after="120"/>
+      </w:pPr>
+      <w:r>
+        <w:rPr>
+          <w:b/>
+          <w:bCs/>
+        </w:rPr>
+        <w:t xml:space="preserve">Mục tiêu.</w:t>
+      </w:r>
+      <w:r>
+        <w:t xml:space="preserve"> Cho Importer được chỉ định ghi thông tin nhập khẩu của lô đã kiểm nghiệm Đạt; lô sang </w:t>
+      </w:r>
+      <w:r>
+        <w:rPr>
+          <w:rFonts w:ascii="Consolas" w:cs="Consolas" w:eastAsia="Consolas" w:hAnsi="Consolas"/>
+          <w:sz w:val="22"/>
+          <w:szCs w:val="22"/>
+        </w:rPr>
+        <w:t xml:space="preserve">Imported</w:t>
+      </w:r>
+      <w:r>
+        <w:t xml:space="preserve"> và Importer trở thành người giữ lô.</w:t>
+      </w:r>
+    </w:p>
+    <w:p>
+      <w:pPr>
+        <w:spacing w:after="120"/>
+      </w:pPr>
+      <w:r>
+        <w:rPr>
+          <w:b/>
+          <w:bCs/>
+        </w:rPr>
+        <w:t xml:space="preserve">Đã làm:</w:t>
+      </w:r>
+    </w:p>
+    <w:p>
+      <w:pPr>
+        <w:pStyle w:val="ListParagraph"/>
+        <w:numPr>
+          <w:ilvl w:val="0"/>
+          <w:numId w:val="2"/>
+        </w:numPr>
+        <w:spacing w:after="60"/>
+      </w:pPr>
+      <w:r>
+        <w:t xml:space="preserve">Hàm </w:t>
+      </w:r>
+      <w:r>
+        <w:rPr>
+          <w:rFonts w:ascii="Consolas" w:cs="Consolas" w:eastAsia="Consolas" w:hAnsi="Consolas"/>
+          <w:sz w:val="22"/>
+          <w:szCs w:val="22"/>
+        </w:rPr>
+        <w:t xml:space="preserve">recordImport(batchId, originCountry, customsDeclNo, importDate, docHash)</w:t>
+      </w:r>
+      <w:r>
+        <w:t xml:space="preserve">.</w:t>
+      </w:r>
+    </w:p>
+    <w:p>
+      <w:pPr>
+        <w:pStyle w:val="ListParagraph"/>
+        <w:numPr>
+          <w:ilvl w:val="0"/>
+          <w:numId w:val="2"/>
+        </w:numPr>
+        <w:spacing w:after="60"/>
+      </w:pPr>
+      <w:r>
+        <w:t xml:space="preserve">Kiểm tra: đúng vai trò Importer; lô tồn tại; lô đang ở </w:t>
+      </w:r>
+      <w:r>
+        <w:rPr>
+          <w:rFonts w:ascii="Consolas" w:cs="Consolas" w:eastAsia="Consolas" w:hAnsi="Consolas"/>
+          <w:sz w:val="22"/>
+          <w:szCs w:val="22"/>
+        </w:rPr>
+        <w:t xml:space="preserve">Tested</w:t>
+      </w:r>
+      <w:r>
+        <w:t xml:space="preserve">; </w:t>
+      </w:r>
+      <w:r>
+        <w:rPr>
+          <w:rFonts w:ascii="Consolas" w:cs="Consolas" w:eastAsia="Consolas" w:hAnsi="Consolas"/>
+          <w:sz w:val="22"/>
+          <w:szCs w:val="22"/>
+        </w:rPr>
+        <w:t xml:space="preserve">docHash</w:t>
+      </w:r>
+      <w:r>
+        <w:t xml:space="preserve"> khác 0; người gọi đúng là Importer được Manufacturer chỉ định ở Bước 1; nước xuất xứ và số tờ khai không rỗng; lô chưa hết hạn.</w:t>
+      </w:r>
+    </w:p>
+    <w:p>
+      <w:pPr>
+        <w:pStyle w:val="ListParagraph"/>
+        <w:numPr>
+          <w:ilvl w:val="0"/>
+          <w:numId w:val="2"/>
+        </w:numPr>
+        <w:spacing w:after="60"/>
+      </w:pPr>
+      <w:r>
+        <w:t xml:space="preserve">Cập nhật trạng thái sang </w:t>
+      </w:r>
+      <w:r>
+        <w:rPr>
+          <w:rFonts w:ascii="Consolas" w:cs="Consolas" w:eastAsia="Consolas" w:hAnsi="Consolas"/>
+          <w:sz w:val="22"/>
+          <w:szCs w:val="22"/>
+        </w:rPr>
+        <w:t xml:space="preserve">Imported</w:t>
+      </w:r>
+      <w:r>
+        <w:t xml:space="preserve">, chuyển người giữ lô (</w:t>
+      </w:r>
+      <w:r>
+        <w:rPr>
+          <w:rFonts w:ascii="Consolas" w:cs="Consolas" w:eastAsia="Consolas" w:hAnsi="Consolas"/>
+          <w:sz w:val="22"/>
+          <w:szCs w:val="22"/>
+        </w:rPr>
+        <w:t xml:space="preserve">holder</w:t>
+      </w:r>
+      <w:r>
+        <w:t xml:space="preserve">) sang Importer và phát event </w:t>
+      </w:r>
+      <w:r>
+        <w:rPr>
+          <w:rFonts w:ascii="Consolas" w:cs="Consolas" w:eastAsia="Consolas" w:hAnsi="Consolas"/>
+          <w:sz w:val="22"/>
+          <w:szCs w:val="22"/>
+        </w:rPr>
+        <w:t xml:space="preserve">BatchImported</w:t>
+      </w:r>
+      <w:r>
+        <w:t xml:space="preserve">.</w:t>
+      </w:r>
+    </w:p>
+    <w:p>
+      <w:pPr>
+        <w:pStyle w:val="ListParagraph"/>
+        <w:numPr>
+          <w:ilvl w:val="0"/>
+          <w:numId w:val="2"/>
+        </w:numPr>
+        <w:spacing w:after="60"/>
+      </w:pPr>
+      <w:r>
+        <w:t xml:space="preserve">Thêm 3 thông báo lỗi </w:t>
+      </w:r>
+      <w:r>
+        <w:rPr>
+          <w:rFonts w:ascii="Consolas" w:cs="Consolas" w:eastAsia="Consolas" w:hAnsi="Consolas"/>
+          <w:sz w:val="22"/>
+          <w:szCs w:val="22"/>
+        </w:rPr>
+        <w:t xml:space="preserve">BR: not designated</w:t>
+      </w:r>
+      <w:r>
+        <w:t xml:space="preserve">, </w:t>
+      </w:r>
+      <w:r>
+        <w:rPr>
+          <w:rFonts w:ascii="Consolas" w:cs="Consolas" w:eastAsia="Consolas" w:hAnsi="Consolas"/>
+          <w:sz w:val="22"/>
+          <w:szCs w:val="22"/>
+        </w:rPr>
+        <w:t xml:space="preserve">BR: empty origin</w:t>
+      </w:r>
+      <w:r>
+        <w:t xml:space="preserve">, </w:t>
+      </w:r>
+      <w:r>
+        <w:rPr>
+          <w:rFonts w:ascii="Consolas" w:cs="Consolas" w:eastAsia="Consolas" w:hAnsi="Consolas"/>
+          <w:sz w:val="22"/>
+          <w:szCs w:val="22"/>
+        </w:rPr>
+        <w:t xml:space="preserve">BR: empty customsDeclNo</w:t>
+      </w:r>
+      <w:r>
+        <w:t xml:space="preserve"> vào mục 7 của </w:t>
+      </w:r>
+      <w:r>
+        <w:rPr>
+          <w:rFonts w:ascii="Consolas" w:cs="Consolas" w:eastAsia="Consolas" w:hAnsi="Consolas"/>
+          <w:sz w:val="22"/>
+          <w:szCs w:val="22"/>
+        </w:rPr>
+        <w:t xml:space="preserve">docs/design.md</w:t>
+      </w:r>
+      <w:r>
+        <w:t xml:space="preserve">.</w:t>
+      </w:r>
+    </w:p>
+    <w:p>
+      <w:pPr>
+        <w:spacing w:after="120"/>
+      </w:pPr>
+      <w:r>
+        <w:rPr>
+          <w:b/>
+          <w:bCs/>
+        </w:rPr>
+        <w:t xml:space="preserve">Quyết định:</w:t>
+      </w:r>
+    </w:p>
+    <w:p>
+      <w:pPr>
+        <w:pStyle w:val="ListParagraph"/>
+        <w:numPr>
+          <w:ilvl w:val="0"/>
+          <w:numId w:val="2"/>
+        </w:numPr>
+        <w:spacing w:after="60"/>
+      </w:pPr>
+      <w:r>
+        <w:t xml:space="preserve">Kiểm tra vai trò trước, kiểm tra "được chỉ định" sau. Vì vậy một Importer khác báo </w:t>
+      </w:r>
+      <w:r>
+        <w:rPr>
+          <w:rFonts w:ascii="Consolas" w:cs="Consolas" w:eastAsia="Consolas" w:hAnsi="Consolas"/>
+          <w:sz w:val="22"/>
+          <w:szCs w:val="22"/>
+        </w:rPr>
+        <w:t xml:space="preserve">BR: not designated</w:t>
+      </w:r>
+      <w:r>
+        <w:t xml:space="preserve">, còn ví không phải Importer báo </w:t>
+      </w:r>
+      <w:r>
+        <w:rPr>
+          <w:rFonts w:ascii="Consolas" w:cs="Consolas" w:eastAsia="Consolas" w:hAnsi="Consolas"/>
+          <w:sz w:val="22"/>
+          <w:szCs w:val="22"/>
+        </w:rPr>
+        <w:t xml:space="preserve">BR: wrong role</w:t>
+      </w:r>
+      <w:r>
+        <w:t xml:space="preserve">.</w:t>
+      </w:r>
+    </w:p>
+    <w:p>
+      <w:pPr>
+        <w:pStyle w:val="ListParagraph"/>
+        <w:numPr>
+          <w:ilvl w:val="0"/>
+          <w:numId w:val="2"/>
+        </w:numPr>
+        <w:spacing w:after="60"/>
+      </w:pPr>
+      <w:r>
+        <w:t xml:space="preserve">Nếu Admin thu hồi vai trò của Importer được chỉ định, ví đó không thao tác được nữa. Nếu sau đó Admin cấp lại đúng vai trò Importer cho chính ví đó, ví lại nhập khẩu được lô cũ. Hành vi này đã được ghi bổ sung vào mục 2 của </w:t>
+      </w:r>
+      <w:r>
+        <w:rPr>
+          <w:rFonts w:ascii="Consolas" w:cs="Consolas" w:eastAsia="Consolas" w:hAnsi="Consolas"/>
+          <w:sz w:val="22"/>
+          <w:szCs w:val="22"/>
+        </w:rPr>
+        <w:t xml:space="preserve">docs/design.md</w:t>
+      </w:r>
+      <w:r>
+        <w:t xml:space="preserve">.</w:t>
+      </w:r>
+    </w:p>
+    <w:p>
+      <w:pPr>
+        <w:pStyle w:val="ListParagraph"/>
+        <w:numPr>
+          <w:ilvl w:val="0"/>
+          <w:numId w:val="2"/>
+        </w:numPr>
+        <w:spacing w:after="60"/>
+      </w:pPr>
+      <w:r>
+        <w:t xml:space="preserve">Ngày nhập khẩu (</w:t>
+      </w:r>
+      <w:r>
+        <w:rPr>
+          <w:rFonts w:ascii="Consolas" w:cs="Consolas" w:eastAsia="Consolas" w:hAnsi="Consolas"/>
+          <w:sz w:val="22"/>
+          <w:szCs w:val="22"/>
+        </w:rPr>
+        <w:t xml:space="preserve">importDate</w:t>
+      </w:r>
+      <w:r>
+        <w:t xml:space="preserve">) do Importer nhập và chỉ ghi vào event; contract không kiểm tra ngày này.</w:t>
+      </w:r>
+    </w:p>
+    <w:p>
+      <w:pPr>
+        <w:spacing w:after="120"/>
+      </w:pPr>
+      <w:r>
+        <w:rPr>
+          <w:b/>
+          <w:bCs/>
+        </w:rPr>
+        <w:t xml:space="preserve">Bằng chứng / kết quả kiểm tra:</w:t>
+      </w:r>
+    </w:p>
+    <w:p>
+      <w:pPr>
+        <w:pStyle w:val="ListParagraph"/>
+        <w:numPr>
+          <w:ilvl w:val="0"/>
+          <w:numId w:val="2"/>
+        </w:numPr>
+        <w:spacing w:after="60"/>
+      </w:pPr>
+      <w:r>
+        <w:t xml:space="preserve">Biên dịch bằng solc 0.8.19 (EVM </w:t>
+      </w:r>
+      <w:r>
+        <w:rPr>
+          <w:rFonts w:ascii="Consolas" w:cs="Consolas" w:eastAsia="Consolas" w:hAnsi="Consolas"/>
+          <w:sz w:val="22"/>
+          <w:szCs w:val="22"/>
+        </w:rPr>
+        <w:t xml:space="preserve">paris</w:t>
+      </w:r>
+      <w:r>
+        <w:t xml:space="preserve">): không lỗi, không cảnh báo, không có opcode </w:t>
+      </w:r>
+      <w:r>
+        <w:rPr>
+          <w:rFonts w:ascii="Consolas" w:cs="Consolas" w:eastAsia="Consolas" w:hAnsi="Consolas"/>
+          <w:sz w:val="22"/>
+          <w:szCs w:val="22"/>
+        </w:rPr>
+        <w:t xml:space="preserve">PUSH0</w:t>
+      </w:r>
+      <w:r>
+        <w:t xml:space="preserve">.</w:t>
+      </w:r>
+    </w:p>
+    <w:p>
+      <w:pPr>
+        <w:pStyle w:val="ListParagraph"/>
+        <w:numPr>
+          <w:ilvl w:val="0"/>
+          <w:numId w:val="2"/>
+        </w:numPr>
+        <w:spacing w:after="60"/>
+      </w:pPr>
+      <w:r>
+        <w:t xml:space="preserve">Chạy 24 kiểm tra trên chuỗi giả lập cục bộ: 24/24 đạt. Chạy lại các bộ của T06 (17), T07 (28), T08 (23) vẫn đạt toàn bộ.</w:t>
+      </w:r>
+    </w:p>
+    <w:p>
+      <w:pPr>
+        <w:pStyle w:val="ListParagraph"/>
+        <w:numPr>
+          <w:ilvl w:val="0"/>
+          <w:numId w:val="2"/>
+        </w:numPr>
+        <w:spacing w:after="60"/>
+      </w:pPr>
+      <w:r>
+        <w:t xml:space="preserve">Trường hợp đúng: lô </w:t>
+      </w:r>
+      <w:r>
+        <w:rPr>
+          <w:rFonts w:ascii="Consolas" w:cs="Consolas" w:eastAsia="Consolas" w:hAnsi="Consolas"/>
+          <w:sz w:val="22"/>
+          <w:szCs w:val="22"/>
+        </w:rPr>
+        <w:t xml:space="preserve">Tested</w:t>
+      </w:r>
+      <w:r>
+        <w:t xml:space="preserve"> sang </w:t>
+      </w:r>
+      <w:r>
+        <w:rPr>
+          <w:rFonts w:ascii="Consolas" w:cs="Consolas" w:eastAsia="Consolas" w:hAnsi="Consolas"/>
+          <w:sz w:val="22"/>
+          <w:szCs w:val="22"/>
+        </w:rPr>
+        <w:t xml:space="preserve">Imported</w:t>
+      </w:r>
+      <w:r>
+        <w:t xml:space="preserve">; holder chuyển sang Importer; các trường Manufacturer, Importer, Receiver không đổi; event đủ trường; lọc event theo </w:t>
+      </w:r>
+      <w:r>
+        <w:rPr>
+          <w:rFonts w:ascii="Consolas" w:cs="Consolas" w:eastAsia="Consolas" w:hAnsi="Consolas"/>
+          <w:sz w:val="22"/>
+          <w:szCs w:val="22"/>
+        </w:rPr>
+        <w:t xml:space="preserve">docHash</w:t>
+      </w:r>
+      <w:r>
+        <w:t xml:space="preserve"> và theo Importer đều đúng.</w:t>
+      </w:r>
+    </w:p>
+    <w:p>
+      <w:pPr>
+        <w:pStyle w:val="ListParagraph"/>
+        <w:numPr>
+          <w:ilvl w:val="0"/>
+          <w:numId w:val="2"/>
+        </w:numPr>
+        <w:spacing w:after="60"/>
+      </w:pPr>
+      <w:r>
+        <w:t xml:space="preserve">Sai trạng thái: lô đã </w:t>
+      </w:r>
+      <w:r>
+        <w:rPr>
+          <w:rFonts w:ascii="Consolas" w:cs="Consolas" w:eastAsia="Consolas" w:hAnsi="Consolas"/>
+          <w:sz w:val="22"/>
+          <w:szCs w:val="22"/>
+        </w:rPr>
+        <w:t xml:space="preserve">Imported</w:t>
+      </w:r>
+      <w:r>
+        <w:t xml:space="preserve">, lô mới </w:t>
+      </w:r>
+      <w:r>
+        <w:rPr>
+          <w:rFonts w:ascii="Consolas" w:cs="Consolas" w:eastAsia="Consolas" w:hAnsi="Consolas"/>
+          <w:sz w:val="22"/>
+          <w:szCs w:val="22"/>
+        </w:rPr>
+        <w:t xml:space="preserve">Registered</w:t>
+      </w:r>
+      <w:r>
+        <w:t xml:space="preserve"> (chưa kiểm nghiệm), lô </w:t>
+      </w:r>
+      <w:r>
+        <w:rPr>
+          <w:rFonts w:ascii="Consolas" w:cs="Consolas" w:eastAsia="Consolas" w:hAnsi="Consolas"/>
+          <w:sz w:val="22"/>
+          <w:szCs w:val="22"/>
+        </w:rPr>
+        <w:t xml:space="preserve">Rejected</w:t>
+      </w:r>
+      <w:r>
+        <w:t xml:space="preserve"> đều bị từ chối.</w:t>
+      </w:r>
+    </w:p>
+    <w:p>
+      <w:pPr>
+        <w:pStyle w:val="ListParagraph"/>
+        <w:numPr>
+          <w:ilvl w:val="0"/>
+          <w:numId w:val="2"/>
+        </w:numPr>
+        <w:spacing w:after="60"/>
+      </w:pPr>
+      <w:r>
+        <w:t xml:space="preserve">Sai người: Importer khác không được chỉ định; Manufacturer, Inspector, Receiver, Admin, ví không vai trò; Importer được chỉ định nhưng đã bị thu hồi.</w:t>
+      </w:r>
+    </w:p>
+    <w:p>
+      <w:pPr>
+        <w:pStyle w:val="ListParagraph"/>
+        <w:numPr>
+          <w:ilvl w:val="0"/>
+          <w:numId w:val="2"/>
+        </w:numPr>
+        <w:spacing w:after="60"/>
+      </w:pPr>
+      <w:r>
+        <w:t xml:space="preserve">Dữ liệu: lô không tồn tại, hash bằng 0, nước xuất xứ rỗng, số tờ khai rỗng đều bị từ chối; lô bị từ chối vẫn ở </w:t>
+      </w:r>
+      <w:r>
+        <w:rPr>
+          <w:rFonts w:ascii="Consolas" w:cs="Consolas" w:eastAsia="Consolas" w:hAnsi="Consolas"/>
+          <w:sz w:val="22"/>
+          <w:szCs w:val="22"/>
+        </w:rPr>
+        <w:t xml:space="preserve">Tested</w:t>
+      </w:r>
+      <w:r>
+        <w:t xml:space="preserve"> và holder vẫn là Manufacturer.</w:t>
+      </w:r>
+    </w:p>
+    <w:p>
+      <w:pPr>
+        <w:pStyle w:val="ListParagraph"/>
+        <w:numPr>
+          <w:ilvl w:val="0"/>
+          <w:numId w:val="2"/>
+        </w:numPr>
+        <w:spacing w:after="60"/>
+      </w:pPr>
+      <w:r>
+        <w:t xml:space="preserve">Hạn dùng: lô đã </w:t>
+      </w:r>
+      <w:r>
+        <w:rPr>
+          <w:rFonts w:ascii="Consolas" w:cs="Consolas" w:eastAsia="Consolas" w:hAnsi="Consolas"/>
+          <w:sz w:val="22"/>
+          <w:szCs w:val="22"/>
+        </w:rPr>
+        <w:t xml:space="preserve">Tested</w:t>
+      </w:r>
+      <w:r>
+        <w:t xml:space="preserve"> nhưng hết hạn trước khi nhập khẩu thì bị từ chối.</w:t>
+      </w:r>
+    </w:p>
+    <w:p>
+      <w:pPr>
+        <w:pStyle w:val="ListParagraph"/>
+        <w:numPr>
+          <w:ilvl w:val="0"/>
+          <w:numId w:val="2"/>
+        </w:numPr>
+        <w:spacing w:after="60"/>
+      </w:pPr>
+      <w:r>
+        <w:t xml:space="preserve">Gas cho một lần </w:t>
+      </w:r>
+      <w:r>
+        <w:rPr>
+          <w:rFonts w:ascii="Consolas" w:cs="Consolas" w:eastAsia="Consolas" w:hAnsi="Consolas"/>
+          <w:sz w:val="22"/>
+          <w:szCs w:val="22"/>
+        </w:rPr>
+        <w:t xml:space="preserve">recordImport</w:t>
+      </w:r>
+      <w:r>
+        <w:t xml:space="preserve">: khoảng 42.000.</w:t>
+      </w:r>
+    </w:p>
+    <w:p>
+      <w:pPr>
+        <w:spacing w:after="120"/>
+      </w:pPr>
+      <w:r>
+        <w:rPr>
+          <w:b/>
+          <w:bCs/>
+        </w:rPr>
+        <w:t xml:space="preserve">Còn lại / việc tiếp theo:</w:t>
+      </w:r>
+    </w:p>
+    <w:p>
+      <w:pPr>
+        <w:pStyle w:val="ListParagraph"/>
+        <w:numPr>
+          <w:ilvl w:val="0"/>
+          <w:numId w:val="2"/>
+        </w:numPr>
+        <w:spacing w:after="60"/>
+      </w:pPr>
+      <w:r>
+        <w:t xml:space="preserve">T10: viết </w:t>
+      </w:r>
+      <w:r>
+        <w:rPr>
+          <w:rFonts w:ascii="Consolas" w:cs="Consolas" w:eastAsia="Consolas" w:hAnsi="Consolas"/>
+          <w:sz w:val="22"/>
+          <w:szCs w:val="22"/>
+        </w:rPr>
+        <w:t xml:space="preserve">initiateTransfer</w:t>
+      </w:r>
+      <w:r>
+        <w:t xml:space="preserve">, </w:t>
+      </w:r>
+      <w:r>
+        <w:rPr>
+          <w:rFonts w:ascii="Consolas" w:cs="Consolas" w:eastAsia="Consolas" w:hAnsi="Consolas"/>
+          <w:sz w:val="22"/>
+          <w:szCs w:val="22"/>
+        </w:rPr>
+        <w:t xml:space="preserve">confirmTransfer</w:t>
+      </w:r>
+      <w:r>
+        <w:t xml:space="preserve"> và các event chuyển giao.</w:t>
       </w:r>
     </w:p>
     <w:p>

</xml_diff>

<commit_message>
thêm hai hàm giao lô và xác nhận giao lô
</commit_message>
<xml_diff>
--- a/docs/nhat-ky-trien-khai.docx
+++ b/docs/nhat-ky-trien-khai.docx
@@ -381,7 +381,7 @@
           </w:tcPr>
           <w:p>
             <w:r>
-              <w:t xml:space="preserve">4</w:t>
+              <w:t xml:space="preserve">5</w:t>
             </w:r>
           </w:p>
         </w:tc>
@@ -403,7 +403,7 @@
           </w:tcPr>
           <w:p>
             <w:r>
-              <w:t xml:space="preserve">T06–T09 xong; T10 là việc tiếp theo</w:t>
+              <w:t xml:space="preserve">T06–T10 xong; còn T44 (Bước 6), T11–T13, T14 tùy chọn</w:t>
             </w:r>
           </w:p>
         </w:tc>
@@ -951,7 +951,7 @@
                 <w:b/>
                 <w:bCs/>
               </w:rPr>
-              <w:t xml:space="preserve">4</w:t>
+              <w:t xml:space="preserve">5</w:t>
             </w:r>
           </w:p>
         </w:tc>
@@ -5687,6 +5687,799 @@
       </w:r>
       <w:r>
         <w:t xml:space="preserve"> và các event chuyển giao.</w:t>
+      </w:r>
+    </w:p>
+    <w:p>
+      <w:pPr>
+        <w:pStyle w:val="Heading3"/>
+      </w:pPr>
+      <w:r>
+        <w:t xml:space="preserve">T10: initiateTransfer, confirmTransfer và các event chuyển giao (Bước 4 và 5)</w:t>
+      </w:r>
+    </w:p>
+    <w:tbl>
+      <w:tblPr>
+        <w:tblW w:type="dxa" w:w="9638"/>
+        <w:tblBorders>
+          <w:top w:val="single" w:color="auto" w:sz="4"/>
+          <w:left w:val="single" w:color="auto" w:sz="4"/>
+          <w:bottom w:val="single" w:color="auto" w:sz="4"/>
+          <w:right w:val="single" w:color="auto" w:sz="4"/>
+          <w:insideH w:val="single" w:color="auto" w:sz="4"/>
+          <w:insideV w:val="single" w:color="auto" w:sz="4"/>
+        </w:tblBorders>
+      </w:tblPr>
+      <w:tblGrid>
+        <w:gridCol w:w="2410"/>
+        <w:gridCol w:w="7228"/>
+      </w:tblGrid>
+      <w:tr>
+        <w:trPr>
+          <w:tblHeader/>
+        </w:trPr>
+        <w:tc>
+          <w:tcPr>
+            <w:tcW w:type="dxa" w:w="2410"/>
+            <w:tcBorders>
+              <w:top w:val="single" w:color="999999" w:sz="4"/>
+              <w:left w:val="single" w:color="999999" w:sz="4"/>
+              <w:bottom w:val="single" w:color="999999" w:sz="4"/>
+              <w:right w:val="single" w:color="999999" w:sz="4"/>
+            </w:tcBorders>
+            <w:shd w:fill="D9E2F3" w:color="auto" w:val="clear"/>
+            <w:tcMar>
+              <w:top w:type="dxa" w:w="60"/>
+              <w:left w:type="dxa" w:w="100"/>
+              <w:bottom w:type="dxa" w:w="60"/>
+              <w:right w:type="dxa" w:w="100"/>
+            </w:tcMar>
+          </w:tcPr>
+          <w:p>
+            <w:r>
+              <w:rPr>
+                <w:b/>
+                <w:bCs/>
+              </w:rPr>
+              <w:t xml:space="preserve">Mục</w:t>
+            </w:r>
+          </w:p>
+        </w:tc>
+        <w:tc>
+          <w:tcPr>
+            <w:tcW w:type="dxa" w:w="7228"/>
+            <w:tcBorders>
+              <w:top w:val="single" w:color="999999" w:sz="4"/>
+              <w:left w:val="single" w:color="999999" w:sz="4"/>
+              <w:bottom w:val="single" w:color="999999" w:sz="4"/>
+              <w:right w:val="single" w:color="999999" w:sz="4"/>
+            </w:tcBorders>
+            <w:shd w:fill="D9E2F3" w:color="auto" w:val="clear"/>
+            <w:tcMar>
+              <w:top w:type="dxa" w:w="60"/>
+              <w:left w:type="dxa" w:w="100"/>
+              <w:bottom w:type="dxa" w:w="60"/>
+              <w:right w:type="dxa" w:w="100"/>
+            </w:tcMar>
+          </w:tcPr>
+          <w:p>
+            <w:r>
+              <w:rPr>
+                <w:b/>
+                <w:bCs/>
+              </w:rPr>
+              <w:t xml:space="preserve">Nội dung</w:t>
+            </w:r>
+          </w:p>
+        </w:tc>
+      </w:tr>
+      <w:tr>
+        <w:trPr>
+          <w:tblHeader w:val="false"/>
+        </w:trPr>
+        <w:tc>
+          <w:tcPr>
+            <w:tcW w:type="dxa" w:w="2410"/>
+            <w:tcBorders>
+              <w:top w:val="single" w:color="999999" w:sz="4"/>
+              <w:left w:val="single" w:color="999999" w:sz="4"/>
+              <w:bottom w:val="single" w:color="999999" w:sz="4"/>
+              <w:right w:val="single" w:color="999999" w:sz="4"/>
+            </w:tcBorders>
+            <w:tcMar>
+              <w:top w:type="dxa" w:w="60"/>
+              <w:left w:type="dxa" w:w="100"/>
+              <w:bottom w:type="dxa" w:w="60"/>
+              <w:right w:type="dxa" w:w="100"/>
+            </w:tcMar>
+          </w:tcPr>
+          <w:p>
+            <w:r>
+              <w:t xml:space="preserve">Ngày</w:t>
+            </w:r>
+          </w:p>
+        </w:tc>
+        <w:tc>
+          <w:tcPr>
+            <w:tcW w:type="dxa" w:w="7228"/>
+            <w:tcBorders>
+              <w:top w:val="single" w:color="999999" w:sz="4"/>
+              <w:left w:val="single" w:color="999999" w:sz="4"/>
+              <w:bottom w:val="single" w:color="999999" w:sz="4"/>
+              <w:right w:val="single" w:color="999999" w:sz="4"/>
+            </w:tcBorders>
+            <w:tcMar>
+              <w:top w:type="dxa" w:w="60"/>
+              <w:left w:type="dxa" w:w="100"/>
+              <w:bottom w:type="dxa" w:w="60"/>
+              <w:right w:type="dxa" w:w="100"/>
+            </w:tcMar>
+          </w:tcPr>
+          <w:p>
+            <w:r>
+              <w:t xml:space="preserve">19/10/2026</w:t>
+            </w:r>
+          </w:p>
+        </w:tc>
+      </w:tr>
+      <w:tr>
+        <w:trPr>
+          <w:tblHeader w:val="false"/>
+        </w:trPr>
+        <w:tc>
+          <w:tcPr>
+            <w:tcW w:type="dxa" w:w="2410"/>
+            <w:tcBorders>
+              <w:top w:val="single" w:color="999999" w:sz="4"/>
+              <w:left w:val="single" w:color="999999" w:sz="4"/>
+              <w:bottom w:val="single" w:color="999999" w:sz="4"/>
+              <w:right w:val="single" w:color="999999" w:sz="4"/>
+            </w:tcBorders>
+            <w:tcMar>
+              <w:top w:type="dxa" w:w="60"/>
+              <w:left w:type="dxa" w:w="100"/>
+              <w:bottom w:type="dxa" w:w="60"/>
+              <w:right w:type="dxa" w:w="100"/>
+            </w:tcMar>
+          </w:tcPr>
+          <w:p>
+            <w:r>
+              <w:t xml:space="preserve">Người thực hiện</w:t>
+            </w:r>
+          </w:p>
+        </w:tc>
+        <w:tc>
+          <w:tcPr>
+            <w:tcW w:type="dxa" w:w="7228"/>
+            <w:tcBorders>
+              <w:top w:val="single" w:color="999999" w:sz="4"/>
+              <w:left w:val="single" w:color="999999" w:sz="4"/>
+              <w:bottom w:val="single" w:color="999999" w:sz="4"/>
+              <w:right w:val="single" w:color="999999" w:sz="4"/>
+            </w:tcBorders>
+            <w:tcMar>
+              <w:top w:type="dxa" w:w="60"/>
+              <w:left w:type="dxa" w:w="100"/>
+              <w:bottom w:type="dxa" w:w="60"/>
+              <w:right w:type="dxa" w:w="100"/>
+            </w:tcMar>
+          </w:tcPr>
+          <w:p>
+            <w:r>
+              <w:t xml:space="preserve">Nguyễn Nhật Huy (với hỗ trợ của Claude)</w:t>
+            </w:r>
+          </w:p>
+        </w:tc>
+      </w:tr>
+      <w:tr>
+        <w:trPr>
+          <w:tblHeader w:val="false"/>
+        </w:trPr>
+        <w:tc>
+          <w:tcPr>
+            <w:tcW w:type="dxa" w:w="2410"/>
+            <w:tcBorders>
+              <w:top w:val="single" w:color="999999" w:sz="4"/>
+              <w:left w:val="single" w:color="999999" w:sz="4"/>
+              <w:bottom w:val="single" w:color="999999" w:sz="4"/>
+              <w:right w:val="single" w:color="999999" w:sz="4"/>
+            </w:tcBorders>
+            <w:tcMar>
+              <w:top w:type="dxa" w:w="60"/>
+              <w:left w:type="dxa" w:w="100"/>
+              <w:bottom w:type="dxa" w:w="60"/>
+              <w:right w:type="dxa" w:w="100"/>
+            </w:tcMar>
+          </w:tcPr>
+          <w:p>
+            <w:r>
+              <w:t xml:space="preserve">Trạng thái</w:t>
+            </w:r>
+          </w:p>
+        </w:tc>
+        <w:tc>
+          <w:tcPr>
+            <w:tcW w:type="dxa" w:w="7228"/>
+            <w:tcBorders>
+              <w:top w:val="single" w:color="999999" w:sz="4"/>
+              <w:left w:val="single" w:color="999999" w:sz="4"/>
+              <w:bottom w:val="single" w:color="999999" w:sz="4"/>
+              <w:right w:val="single" w:color="999999" w:sz="4"/>
+            </w:tcBorders>
+            <w:tcMar>
+              <w:top w:type="dxa" w:w="60"/>
+              <w:left w:type="dxa" w:w="100"/>
+              <w:bottom w:type="dxa" w:w="60"/>
+              <w:right w:type="dxa" w:w="100"/>
+            </w:tcMar>
+          </w:tcPr>
+          <w:p>
+            <w:r>
+              <w:t xml:space="preserve">Xong</w:t>
+            </w:r>
+          </w:p>
+        </w:tc>
+      </w:tr>
+    </w:tbl>
+    <w:p>
+      <w:pPr>
+        <w:spacing w:after="120"/>
+      </w:pPr>
+    </w:p>
+    <w:p>
+      <w:pPr>
+        <w:spacing w:after="120"/>
+      </w:pPr>
+      <w:r>
+        <w:rPr>
+          <w:b/>
+          <w:bCs/>
+        </w:rPr>
+        <w:t xml:space="preserve">Mục tiêu.</w:t>
+      </w:r>
+      <w:r>
+        <w:t xml:space="preserve"> Chuyển giao hai chiều: Importer khởi tạo chuyển giao lô cho một Receiver đích danh, Receiver xác nhận đã nhận đúng và đủ.</w:t>
+      </w:r>
+    </w:p>
+    <w:p>
+      <w:pPr>
+        <w:spacing w:after="120"/>
+      </w:pPr>
+      <w:r>
+        <w:rPr>
+          <w:b/>
+          <w:bCs/>
+        </w:rPr>
+        <w:t xml:space="preserve">Đã làm:</w:t>
+      </w:r>
+    </w:p>
+    <w:p>
+      <w:pPr>
+        <w:pStyle w:val="ListParagraph"/>
+        <w:numPr>
+          <w:ilvl w:val="0"/>
+          <w:numId w:val="2"/>
+        </w:numPr>
+        <w:spacing w:after="60"/>
+      </w:pPr>
+      <w:r>
+        <w:rPr>
+          <w:rFonts w:ascii="Consolas" w:cs="Consolas" w:eastAsia="Consolas" w:hAnsi="Consolas"/>
+          <w:sz w:val="22"/>
+          <w:szCs w:val="22"/>
+        </w:rPr>
+        <w:t xml:space="preserve">initiateTransfer(batchId, receiver, docHash)</w:t>
+      </w:r>
+      <w:r>
+        <w:t xml:space="preserve">: chỉ Importer được chỉ định, lô ở </w:t>
+      </w:r>
+      <w:r>
+        <w:rPr>
+          <w:rFonts w:ascii="Consolas" w:cs="Consolas" w:eastAsia="Consolas" w:hAnsi="Consolas"/>
+          <w:sz w:val="22"/>
+          <w:szCs w:val="22"/>
+        </w:rPr>
+        <w:t xml:space="preserve">Imported</w:t>
+      </w:r>
+      <w:r>
+        <w:t xml:space="preserve">, ví bên nhận phải có vai trò Receiver, lô chưa hết hạn. Lô sang </w:t>
+      </w:r>
+      <w:r>
+        <w:rPr>
+          <w:rFonts w:ascii="Consolas" w:cs="Consolas" w:eastAsia="Consolas" w:hAnsi="Consolas"/>
+          <w:sz w:val="22"/>
+          <w:szCs w:val="22"/>
+        </w:rPr>
+        <w:t xml:space="preserve">InTransfer</w:t>
+      </w:r>
+      <w:r>
+        <w:t xml:space="preserve">, ghi lại Receiver được chỉ định, phát </w:t>
+      </w:r>
+      <w:r>
+        <w:rPr>
+          <w:rFonts w:ascii="Consolas" w:cs="Consolas" w:eastAsia="Consolas" w:hAnsi="Consolas"/>
+          <w:sz w:val="22"/>
+          <w:szCs w:val="22"/>
+        </w:rPr>
+        <w:t xml:space="preserve">TransferInitiated</w:t>
+      </w:r>
+      <w:r>
+        <w:t xml:space="preserve">.</w:t>
+      </w:r>
+    </w:p>
+    <w:p>
+      <w:pPr>
+        <w:pStyle w:val="ListParagraph"/>
+        <w:numPr>
+          <w:ilvl w:val="0"/>
+          <w:numId w:val="2"/>
+        </w:numPr>
+        <w:spacing w:after="60"/>
+      </w:pPr>
+      <w:r>
+        <w:rPr>
+          <w:rFonts w:ascii="Consolas" w:cs="Consolas" w:eastAsia="Consolas" w:hAnsi="Consolas"/>
+          <w:sz w:val="22"/>
+          <w:szCs w:val="22"/>
+        </w:rPr>
+        <w:t xml:space="preserve">confirmTransfer(batchId, docHash)</w:t>
+      </w:r>
+      <w:r>
+        <w:t xml:space="preserve">: chỉ Receiver được chỉ định, lô ở </w:t>
+      </w:r>
+      <w:r>
+        <w:rPr>
+          <w:rFonts w:ascii="Consolas" w:cs="Consolas" w:eastAsia="Consolas" w:hAnsi="Consolas"/>
+          <w:sz w:val="22"/>
+          <w:szCs w:val="22"/>
+        </w:rPr>
+        <w:t xml:space="preserve">InTransfer</w:t>
+      </w:r>
+      <w:r>
+        <w:t xml:space="preserve">. Lô sang </w:t>
+      </w:r>
+      <w:r>
+        <w:rPr>
+          <w:rFonts w:ascii="Consolas" w:cs="Consolas" w:eastAsia="Consolas" w:hAnsi="Consolas"/>
+          <w:sz w:val="22"/>
+          <w:szCs w:val="22"/>
+        </w:rPr>
+        <w:t xml:space="preserve">Received</w:t>
+      </w:r>
+      <w:r>
+        <w:t xml:space="preserve">, Receiver trở thành người giữ lô, phát </w:t>
+      </w:r>
+      <w:r>
+        <w:rPr>
+          <w:rFonts w:ascii="Consolas" w:cs="Consolas" w:eastAsia="Consolas" w:hAnsi="Consolas"/>
+          <w:sz w:val="22"/>
+          <w:szCs w:val="22"/>
+        </w:rPr>
+        <w:t xml:space="preserve">TransferConfirmed</w:t>
+      </w:r>
+      <w:r>
+        <w:t xml:space="preserve">.</w:t>
+      </w:r>
+    </w:p>
+    <w:p>
+      <w:pPr>
+        <w:pStyle w:val="ListParagraph"/>
+        <w:numPr>
+          <w:ilvl w:val="0"/>
+          <w:numId w:val="2"/>
+        </w:numPr>
+        <w:spacing w:after="60"/>
+      </w:pPr>
+      <w:r>
+        <w:t xml:space="preserve">Thêm thông báo lỗi </w:t>
+      </w:r>
+      <w:r>
+        <w:rPr>
+          <w:rFonts w:ascii="Consolas" w:cs="Consolas" w:eastAsia="Consolas" w:hAnsi="Consolas"/>
+          <w:sz w:val="22"/>
+          <w:szCs w:val="22"/>
+        </w:rPr>
+        <w:t xml:space="preserve">BR: not receiver</w:t>
+      </w:r>
+      <w:r>
+        <w:t xml:space="preserve"> vào mục 7 của </w:t>
+      </w:r>
+      <w:r>
+        <w:rPr>
+          <w:rFonts w:ascii="Consolas" w:cs="Consolas" w:eastAsia="Consolas" w:hAnsi="Consolas"/>
+          <w:sz w:val="22"/>
+          <w:szCs w:val="22"/>
+        </w:rPr>
+        <w:t xml:space="preserve">docs/design.md</w:t>
+      </w:r>
+      <w:r>
+        <w:t xml:space="preserve">.</w:t>
+      </w:r>
+    </w:p>
+    <w:p>
+      <w:pPr>
+        <w:spacing w:after="120"/>
+      </w:pPr>
+      <w:r>
+        <w:rPr>
+          <w:b/>
+          <w:bCs/>
+        </w:rPr>
+        <w:t xml:space="preserve">Quyết định:</w:t>
+      </w:r>
+    </w:p>
+    <w:p>
+      <w:pPr>
+        <w:pStyle w:val="ListParagraph"/>
+        <w:numPr>
+          <w:ilvl w:val="0"/>
+          <w:numId w:val="2"/>
+        </w:numPr>
+        <w:spacing w:after="60"/>
+      </w:pPr>
+      <w:r>
+        <w:t xml:space="preserve">Trong lúc </w:t>
+      </w:r>
+      <w:r>
+        <w:rPr>
+          <w:rFonts w:ascii="Consolas" w:cs="Consolas" w:eastAsia="Consolas" w:hAnsi="Consolas"/>
+          <w:sz w:val="22"/>
+          <w:szCs w:val="22"/>
+        </w:rPr>
+        <w:t xml:space="preserve">InTransfer</w:t>
+      </w:r>
+      <w:r>
+        <w:t xml:space="preserve">, Importer vẫn là người giữ lô; người giữ chỉ chuyển sang Receiver khi Receiver xác nhận.</w:t>
+      </w:r>
+    </w:p>
+    <w:p>
+      <w:pPr>
+        <w:pStyle w:val="ListParagraph"/>
+        <w:numPr>
+          <w:ilvl w:val="0"/>
+          <w:numId w:val="2"/>
+        </w:numPr>
+        <w:spacing w:after="60"/>
+      </w:pPr>
+      <w:r>
+        <w:t xml:space="preserve">Xác nhận tiếp nhận không bị chặn khi lô đã hết hạn, vì hàng đã đến nơi thật. Lô hết hạn sẽ đi tiếp tới Bước 6 và chỉ được ghi kết quả Không đạt (</w:t>
+      </w:r>
+      <w:r>
+        <w:rPr>
+          <w:rFonts w:ascii="Consolas" w:cs="Consolas" w:eastAsia="Consolas" w:hAnsi="Consolas"/>
+          <w:sz w:val="22"/>
+          <w:szCs w:val="22"/>
+        </w:rPr>
+        <w:t xml:space="preserve">Quarantined</w:t>
+      </w:r>
+      <w:r>
+        <w:t xml:space="preserve">).</w:t>
+      </w:r>
+    </w:p>
+    <w:p>
+      <w:pPr>
+        <w:pStyle w:val="ListParagraph"/>
+        <w:numPr>
+          <w:ilvl w:val="0"/>
+          <w:numId w:val="2"/>
+        </w:numPr>
+        <w:spacing w:after="60"/>
+      </w:pPr>
+      <w:r>
+        <w:t xml:space="preserve">Nếu Receiver không xác nhận, lô giữ nguyên </w:t>
+      </w:r>
+      <w:r>
+        <w:rPr>
+          <w:rFonts w:ascii="Consolas" w:cs="Consolas" w:eastAsia="Consolas" w:hAnsi="Consolas"/>
+          <w:sz w:val="22"/>
+          <w:szCs w:val="22"/>
+        </w:rPr>
+        <w:t xml:space="preserve">InTransfer</w:t>
+      </w:r>
+      <w:r>
+        <w:t xml:space="preserve"> và hai bên xử lý ngoài hệ thống, đúng như proposal.</w:t>
+      </w:r>
+    </w:p>
+    <w:p>
+      <w:pPr>
+        <w:spacing w:after="120"/>
+      </w:pPr>
+      <w:r>
+        <w:rPr>
+          <w:b/>
+          <w:bCs/>
+        </w:rPr>
+        <w:t xml:space="preserve">Vấn đề gặp phải và cách xử lý:</w:t>
+      </w:r>
+    </w:p>
+    <w:p>
+      <w:pPr>
+        <w:pStyle w:val="ListParagraph"/>
+        <w:numPr>
+          <w:ilvl w:val="0"/>
+          <w:numId w:val="2"/>
+        </w:numPr>
+        <w:spacing w:after="60"/>
+      </w:pPr>
+      <w:r>
+        <w:rPr>
+          <w:b/>
+          <w:bCs/>
+        </w:rPr>
+        <w:t xml:space="preserve">Rủi ro lô bị kẹt ở trạng thái InTransfer</w:t>
+      </w:r>
+      <w:r>
+        <w:t xml:space="preserve">: nếu Receiver được chỉ định bị thu hồi vai trò (hoặc không bao giờ xác nhận), hiện không có cách nào đưa lô về lại. Hàm tùy chọn </w:t>
+      </w:r>
+      <w:r>
+        <w:rPr>
+          <w:rFonts w:ascii="Consolas" w:cs="Consolas" w:eastAsia="Consolas" w:hAnsi="Consolas"/>
+          <w:sz w:val="22"/>
+          <w:szCs w:val="22"/>
+        </w:rPr>
+        <w:t xml:space="preserve">cancelTransfer</w:t>
+      </w:r>
+      <w:r>
+        <w:t xml:space="preserve"> (T14) sẽ giải quyết trường hợp này, nên cân nhắc làm T14 nếu còn thời gian.</w:t>
+      </w:r>
+    </w:p>
+    <w:p>
+      <w:pPr>
+        <w:spacing w:after="120"/>
+      </w:pPr>
+      <w:r>
+        <w:rPr>
+          <w:b/>
+          <w:bCs/>
+        </w:rPr>
+        <w:t xml:space="preserve">Bằng chứng / kết quả kiểm tra:</w:t>
+      </w:r>
+    </w:p>
+    <w:p>
+      <w:pPr>
+        <w:pStyle w:val="ListParagraph"/>
+        <w:numPr>
+          <w:ilvl w:val="0"/>
+          <w:numId w:val="2"/>
+        </w:numPr>
+        <w:spacing w:after="60"/>
+      </w:pPr>
+      <w:r>
+        <w:t xml:space="preserve">Biên dịch bằng solc 0.8.19 (EVM </w:t>
+      </w:r>
+      <w:r>
+        <w:rPr>
+          <w:rFonts w:ascii="Consolas" w:cs="Consolas" w:eastAsia="Consolas" w:hAnsi="Consolas"/>
+          <w:sz w:val="22"/>
+          <w:szCs w:val="22"/>
+        </w:rPr>
+        <w:t xml:space="preserve">paris</w:t>
+      </w:r>
+      <w:r>
+        <w:t xml:space="preserve">): không lỗi, không cảnh báo, không có opcode </w:t>
+      </w:r>
+      <w:r>
+        <w:rPr>
+          <w:rFonts w:ascii="Consolas" w:cs="Consolas" w:eastAsia="Consolas" w:hAnsi="Consolas"/>
+          <w:sz w:val="22"/>
+          <w:szCs w:val="22"/>
+        </w:rPr>
+        <w:t xml:space="preserve">PUSH0</w:t>
+      </w:r>
+      <w:r>
+        <w:t xml:space="preserve">.</w:t>
+      </w:r>
+    </w:p>
+    <w:p>
+      <w:pPr>
+        <w:pStyle w:val="ListParagraph"/>
+        <w:numPr>
+          <w:ilvl w:val="0"/>
+          <w:numId w:val="2"/>
+        </w:numPr>
+        <w:spacing w:after="60"/>
+      </w:pPr>
+      <w:r>
+        <w:t xml:space="preserve">Chạy 43 kiểm tra trên chuỗi giả lập cục bộ: 43/43 đạt. Chạy lại các bộ của T06 (17), T07 (28), T08 (23), T09 (24) vẫn đạt toàn bộ.</w:t>
+      </w:r>
+    </w:p>
+    <w:p>
+      <w:pPr>
+        <w:pStyle w:val="ListParagraph"/>
+        <w:numPr>
+          <w:ilvl w:val="0"/>
+          <w:numId w:val="2"/>
+        </w:numPr>
+        <w:spacing w:after="60"/>
+      </w:pPr>
+      <w:r>
+        <w:t xml:space="preserve">Khởi tạo chuyển giao: </w:t>
+      </w:r>
+      <w:r>
+        <w:rPr>
+          <w:rFonts w:ascii="Consolas" w:cs="Consolas" w:eastAsia="Consolas" w:hAnsi="Consolas"/>
+          <w:sz w:val="22"/>
+          <w:szCs w:val="22"/>
+        </w:rPr>
+        <w:t xml:space="preserve">Imported</w:t>
+      </w:r>
+      <w:r>
+        <w:t xml:space="preserve"> sang </w:t>
+      </w:r>
+      <w:r>
+        <w:rPr>
+          <w:rFonts w:ascii="Consolas" w:cs="Consolas" w:eastAsia="Consolas" w:hAnsi="Consolas"/>
+          <w:sz w:val="22"/>
+          <w:szCs w:val="22"/>
+        </w:rPr>
+        <w:t xml:space="preserve">InTransfer</w:t>
+      </w:r>
+      <w:r>
+        <w:t xml:space="preserve">, ghi đúng Receiver, holder vẫn là Importer, event đủ trường. Bị từ chối khi: khởi tạo lại; Importer khác; Manufacturer, Inspector, Receiver, Admin, ví không vai trò; bên nhận là ví Importer, ví không vai trò, địa chỉ 0 hoặc Receiver đã bị thu hồi; hash bằng 0; lô không tồn tại; lô còn ở </w:t>
+      </w:r>
+      <w:r>
+        <w:rPr>
+          <w:rFonts w:ascii="Consolas" w:cs="Consolas" w:eastAsia="Consolas" w:hAnsi="Consolas"/>
+          <w:sz w:val="22"/>
+          <w:szCs w:val="22"/>
+        </w:rPr>
+        <w:t xml:space="preserve">Registered</w:t>
+      </w:r>
+      <w:r>
+        <w:t xml:space="preserve"> hoặc </w:t>
+      </w:r>
+      <w:r>
+        <w:rPr>
+          <w:rFonts w:ascii="Consolas" w:cs="Consolas" w:eastAsia="Consolas" w:hAnsi="Consolas"/>
+          <w:sz w:val="22"/>
+          <w:szCs w:val="22"/>
+        </w:rPr>
+        <w:t xml:space="preserve">Tested</w:t>
+      </w:r>
+      <w:r>
+        <w:t xml:space="preserve">; lô đã hết hạn.</w:t>
+      </w:r>
+    </w:p>
+    <w:p>
+      <w:pPr>
+        <w:pStyle w:val="ListParagraph"/>
+        <w:numPr>
+          <w:ilvl w:val="0"/>
+          <w:numId w:val="2"/>
+        </w:numPr>
+        <w:spacing w:after="60"/>
+      </w:pPr>
+      <w:r>
+        <w:t xml:space="preserve">Xác nhận tiếp nhận: </w:t>
+      </w:r>
+      <w:r>
+        <w:rPr>
+          <w:rFonts w:ascii="Consolas" w:cs="Consolas" w:eastAsia="Consolas" w:hAnsi="Consolas"/>
+          <w:sz w:val="22"/>
+          <w:szCs w:val="22"/>
+        </w:rPr>
+        <w:t xml:space="preserve">InTransfer</w:t>
+      </w:r>
+      <w:r>
+        <w:t xml:space="preserve"> sang </w:t>
+      </w:r>
+      <w:r>
+        <w:rPr>
+          <w:rFonts w:ascii="Consolas" w:cs="Consolas" w:eastAsia="Consolas" w:hAnsi="Consolas"/>
+          <w:sz w:val="22"/>
+          <w:szCs w:val="22"/>
+        </w:rPr>
+        <w:t xml:space="preserve">Received</w:t>
+      </w:r>
+      <w:r>
+        <w:t xml:space="preserve">, holder chuyển sang Receiver, event đủ trường. Bị từ chối khi: xác nhận lại; Receiver khác (kể cả khi lô được giao cho Receiver thứ hai thì Receiver đầu tiên không xác nhận được); Importer bên giao và các vai trò khác; hash bằng 0; lô không tồn tại; lô chưa khởi tạo chuyển giao; Receiver đã bị thu hồi. Cấp lại vai trò Receiver thì xác nhận được.</w:t>
+      </w:r>
+    </w:p>
+    <w:p>
+      <w:pPr>
+        <w:pStyle w:val="ListParagraph"/>
+        <w:numPr>
+          <w:ilvl w:val="0"/>
+          <w:numId w:val="2"/>
+        </w:numPr>
+        <w:spacing w:after="60"/>
+      </w:pPr>
+      <w:r>
+        <w:t xml:space="preserve">Xác nhận tiếp nhận lô đã hết hạn vẫn được.</w:t>
+      </w:r>
+    </w:p>
+    <w:p>
+      <w:pPr>
+        <w:pStyle w:val="ListParagraph"/>
+        <w:numPr>
+          <w:ilvl w:val="0"/>
+          <w:numId w:val="2"/>
+        </w:numPr>
+        <w:spacing w:after="60"/>
+      </w:pPr>
+      <w:r>
+        <w:t xml:space="preserve">Lọc event theo </w:t>
+      </w:r>
+      <w:r>
+        <w:rPr>
+          <w:rFonts w:ascii="Consolas" w:cs="Consolas" w:eastAsia="Consolas" w:hAnsi="Consolas"/>
+          <w:sz w:val="22"/>
+          <w:szCs w:val="22"/>
+        </w:rPr>
+        <w:t xml:space="preserve">batchId</w:t>
+      </w:r>
+      <w:r>
+        <w:t xml:space="preserve"> và theo Receiver đều đúng.</w:t>
+      </w:r>
+    </w:p>
+    <w:p>
+      <w:pPr>
+        <w:pStyle w:val="ListParagraph"/>
+        <w:numPr>
+          <w:ilvl w:val="0"/>
+          <w:numId w:val="2"/>
+        </w:numPr>
+        <w:spacing w:after="60"/>
+      </w:pPr>
+      <w:r>
+        <w:t xml:space="preserve">Gas: </w:t>
+      </w:r>
+      <w:r>
+        <w:rPr>
+          <w:rFonts w:ascii="Consolas" w:cs="Consolas" w:eastAsia="Consolas" w:hAnsi="Consolas"/>
+          <w:sz w:val="22"/>
+          <w:szCs w:val="22"/>
+        </w:rPr>
+        <w:t xml:space="preserve">initiateTransfer</w:t>
+      </w:r>
+      <w:r>
+        <w:t xml:space="preserve"> khoảng 63.000, </w:t>
+      </w:r>
+      <w:r>
+        <w:rPr>
+          <w:rFonts w:ascii="Consolas" w:cs="Consolas" w:eastAsia="Consolas" w:hAnsi="Consolas"/>
+          <w:sz w:val="22"/>
+          <w:szCs w:val="22"/>
+        </w:rPr>
+        <w:t xml:space="preserve">confirmTransfer</w:t>
+      </w:r>
+      <w:r>
+        <w:t xml:space="preserve"> khoảng 37.000.</w:t>
+      </w:r>
+    </w:p>
+    <w:p>
+      <w:pPr>
+        <w:spacing w:after="120"/>
+      </w:pPr>
+      <w:r>
+        <w:rPr>
+          <w:b/>
+          <w:bCs/>
+        </w:rPr>
+        <w:t xml:space="preserve">Còn lại / việc tiếp theo:</w:t>
+      </w:r>
+    </w:p>
+    <w:p>
+      <w:pPr>
+        <w:pStyle w:val="ListParagraph"/>
+        <w:numPr>
+          <w:ilvl w:val="0"/>
+          <w:numId w:val="2"/>
+        </w:numPr>
+        <w:spacing w:after="60"/>
+      </w:pPr>
+      <w:r>
+        <w:t xml:space="preserve">T44: viết </w:t>
+      </w:r>
+      <w:r>
+        <w:rPr>
+          <w:rFonts w:ascii="Consolas" w:cs="Consolas" w:eastAsia="Consolas" w:hAnsi="Consolas"/>
+          <w:sz w:val="22"/>
+          <w:szCs w:val="22"/>
+        </w:rPr>
+        <w:t xml:space="preserve">recordReceivingInspection</w:t>
+      </w:r>
+      <w:r>
+        <w:t xml:space="preserve"> cho Bước 6 (kiểm tra tại nơi nhận).</w:t>
       </w:r>
     </w:p>
     <w:p>

</xml_diff>

<commit_message>
thêm hàm kiểm tra hàng của receiver
</commit_message>
<xml_diff>
--- a/docs/nhat-ky-trien-khai.docx
+++ b/docs/nhat-ky-trien-khai.docx
@@ -65,7 +65,7 @@
         <w:t xml:space="preserve">Cập nhật lần cuối:</w:t>
       </w:r>
       <w:r>
-        <w:t xml:space="preserve"> 19/10/2026.</w:t>
+        <w:t xml:space="preserve"> 20/10/2026.</w:t>
       </w:r>
     </w:p>
     <w:p>
@@ -381,7 +381,7 @@
           </w:tcPr>
           <w:p>
             <w:r>
-              <w:t xml:space="preserve">5</w:t>
+              <w:t xml:space="preserve">6</w:t>
             </w:r>
           </w:p>
         </w:tc>
@@ -403,7 +403,7 @@
           </w:tcPr>
           <w:p>
             <w:r>
-              <w:t xml:space="preserve">T06–T10 xong; còn T44 (Bước 6), T11–T13, T14 tùy chọn</w:t>
+              <w:t xml:space="preserve">T06–T10, T44 xong: contract đủ Bước 0 đến 6; còn T11–T13, T14 tùy chọn</w:t>
             </w:r>
           </w:p>
         </w:tc>
@@ -951,7 +951,7 @@
                 <w:b/>
                 <w:bCs/>
               </w:rPr>
-              <w:t xml:space="preserve">5</w:t>
+              <w:t xml:space="preserve">6</w:t>
             </w:r>
           </w:p>
         </w:tc>
@@ -6480,6 +6480,821 @@
       </w:r>
       <w:r>
         <w:t xml:space="preserve"> cho Bước 6 (kiểm tra tại nơi nhận).</w:t>
+      </w:r>
+    </w:p>
+    <w:p>
+      <w:pPr>
+        <w:pStyle w:val="Heading3"/>
+      </w:pPr>
+      <w:r>
+        <w:t xml:space="preserve">T44: recordReceivingInspection và event ReceivingInspected (Bước 6)</w:t>
+      </w:r>
+    </w:p>
+    <w:tbl>
+      <w:tblPr>
+        <w:tblW w:type="dxa" w:w="9638"/>
+        <w:tblBorders>
+          <w:top w:val="single" w:color="auto" w:sz="4"/>
+          <w:left w:val="single" w:color="auto" w:sz="4"/>
+          <w:bottom w:val="single" w:color="auto" w:sz="4"/>
+          <w:right w:val="single" w:color="auto" w:sz="4"/>
+          <w:insideH w:val="single" w:color="auto" w:sz="4"/>
+          <w:insideV w:val="single" w:color="auto" w:sz="4"/>
+        </w:tblBorders>
+      </w:tblPr>
+      <w:tblGrid>
+        <w:gridCol w:w="2410"/>
+        <w:gridCol w:w="7228"/>
+      </w:tblGrid>
+      <w:tr>
+        <w:trPr>
+          <w:tblHeader/>
+        </w:trPr>
+        <w:tc>
+          <w:tcPr>
+            <w:tcW w:type="dxa" w:w="2410"/>
+            <w:tcBorders>
+              <w:top w:val="single" w:color="999999" w:sz="4"/>
+              <w:left w:val="single" w:color="999999" w:sz="4"/>
+              <w:bottom w:val="single" w:color="999999" w:sz="4"/>
+              <w:right w:val="single" w:color="999999" w:sz="4"/>
+            </w:tcBorders>
+            <w:shd w:fill="D9E2F3" w:color="auto" w:val="clear"/>
+            <w:tcMar>
+              <w:top w:type="dxa" w:w="60"/>
+              <w:left w:type="dxa" w:w="100"/>
+              <w:bottom w:type="dxa" w:w="60"/>
+              <w:right w:type="dxa" w:w="100"/>
+            </w:tcMar>
+          </w:tcPr>
+          <w:p>
+            <w:r>
+              <w:rPr>
+                <w:b/>
+                <w:bCs/>
+              </w:rPr>
+              <w:t xml:space="preserve">Mục</w:t>
+            </w:r>
+          </w:p>
+        </w:tc>
+        <w:tc>
+          <w:tcPr>
+            <w:tcW w:type="dxa" w:w="7228"/>
+            <w:tcBorders>
+              <w:top w:val="single" w:color="999999" w:sz="4"/>
+              <w:left w:val="single" w:color="999999" w:sz="4"/>
+              <w:bottom w:val="single" w:color="999999" w:sz="4"/>
+              <w:right w:val="single" w:color="999999" w:sz="4"/>
+            </w:tcBorders>
+            <w:shd w:fill="D9E2F3" w:color="auto" w:val="clear"/>
+            <w:tcMar>
+              <w:top w:type="dxa" w:w="60"/>
+              <w:left w:type="dxa" w:w="100"/>
+              <w:bottom w:type="dxa" w:w="60"/>
+              <w:right w:type="dxa" w:w="100"/>
+            </w:tcMar>
+          </w:tcPr>
+          <w:p>
+            <w:r>
+              <w:rPr>
+                <w:b/>
+                <w:bCs/>
+              </w:rPr>
+              <w:t xml:space="preserve">Nội dung</w:t>
+            </w:r>
+          </w:p>
+        </w:tc>
+      </w:tr>
+      <w:tr>
+        <w:trPr>
+          <w:tblHeader w:val="false"/>
+        </w:trPr>
+        <w:tc>
+          <w:tcPr>
+            <w:tcW w:type="dxa" w:w="2410"/>
+            <w:tcBorders>
+              <w:top w:val="single" w:color="999999" w:sz="4"/>
+              <w:left w:val="single" w:color="999999" w:sz="4"/>
+              <w:bottom w:val="single" w:color="999999" w:sz="4"/>
+              <w:right w:val="single" w:color="999999" w:sz="4"/>
+            </w:tcBorders>
+            <w:tcMar>
+              <w:top w:type="dxa" w:w="60"/>
+              <w:left w:type="dxa" w:w="100"/>
+              <w:bottom w:type="dxa" w:w="60"/>
+              <w:right w:type="dxa" w:w="100"/>
+            </w:tcMar>
+          </w:tcPr>
+          <w:p>
+            <w:r>
+              <w:t xml:space="preserve">Ngày</w:t>
+            </w:r>
+          </w:p>
+        </w:tc>
+        <w:tc>
+          <w:tcPr>
+            <w:tcW w:type="dxa" w:w="7228"/>
+            <w:tcBorders>
+              <w:top w:val="single" w:color="999999" w:sz="4"/>
+              <w:left w:val="single" w:color="999999" w:sz="4"/>
+              <w:bottom w:val="single" w:color="999999" w:sz="4"/>
+              <w:right w:val="single" w:color="999999" w:sz="4"/>
+            </w:tcBorders>
+            <w:tcMar>
+              <w:top w:type="dxa" w:w="60"/>
+              <w:left w:type="dxa" w:w="100"/>
+              <w:bottom w:type="dxa" w:w="60"/>
+              <w:right w:type="dxa" w:w="100"/>
+            </w:tcMar>
+          </w:tcPr>
+          <w:p>
+            <w:r>
+              <w:t xml:space="preserve">20/10/2026</w:t>
+            </w:r>
+          </w:p>
+        </w:tc>
+      </w:tr>
+      <w:tr>
+        <w:trPr>
+          <w:tblHeader w:val="false"/>
+        </w:trPr>
+        <w:tc>
+          <w:tcPr>
+            <w:tcW w:type="dxa" w:w="2410"/>
+            <w:tcBorders>
+              <w:top w:val="single" w:color="999999" w:sz="4"/>
+              <w:left w:val="single" w:color="999999" w:sz="4"/>
+              <w:bottom w:val="single" w:color="999999" w:sz="4"/>
+              <w:right w:val="single" w:color="999999" w:sz="4"/>
+            </w:tcBorders>
+            <w:tcMar>
+              <w:top w:type="dxa" w:w="60"/>
+              <w:left w:type="dxa" w:w="100"/>
+              <w:bottom w:type="dxa" w:w="60"/>
+              <w:right w:type="dxa" w:w="100"/>
+            </w:tcMar>
+          </w:tcPr>
+          <w:p>
+            <w:r>
+              <w:t xml:space="preserve">Người thực hiện</w:t>
+            </w:r>
+          </w:p>
+        </w:tc>
+        <w:tc>
+          <w:tcPr>
+            <w:tcW w:type="dxa" w:w="7228"/>
+            <w:tcBorders>
+              <w:top w:val="single" w:color="999999" w:sz="4"/>
+              <w:left w:val="single" w:color="999999" w:sz="4"/>
+              <w:bottom w:val="single" w:color="999999" w:sz="4"/>
+              <w:right w:val="single" w:color="999999" w:sz="4"/>
+            </w:tcBorders>
+            <w:tcMar>
+              <w:top w:type="dxa" w:w="60"/>
+              <w:left w:type="dxa" w:w="100"/>
+              <w:bottom w:type="dxa" w:w="60"/>
+              <w:right w:type="dxa" w:w="100"/>
+            </w:tcMar>
+          </w:tcPr>
+          <w:p>
+            <w:r>
+              <w:t xml:space="preserve">Nguyễn Nhật Huy (với hỗ trợ của Claude)</w:t>
+            </w:r>
+          </w:p>
+        </w:tc>
+      </w:tr>
+      <w:tr>
+        <w:trPr>
+          <w:tblHeader w:val="false"/>
+        </w:trPr>
+        <w:tc>
+          <w:tcPr>
+            <w:tcW w:type="dxa" w:w="2410"/>
+            <w:tcBorders>
+              <w:top w:val="single" w:color="999999" w:sz="4"/>
+              <w:left w:val="single" w:color="999999" w:sz="4"/>
+              <w:bottom w:val="single" w:color="999999" w:sz="4"/>
+              <w:right w:val="single" w:color="999999" w:sz="4"/>
+            </w:tcBorders>
+            <w:tcMar>
+              <w:top w:type="dxa" w:w="60"/>
+              <w:left w:type="dxa" w:w="100"/>
+              <w:bottom w:type="dxa" w:w="60"/>
+              <w:right w:type="dxa" w:w="100"/>
+            </w:tcMar>
+          </w:tcPr>
+          <w:p>
+            <w:r>
+              <w:t xml:space="preserve">Trạng thái</w:t>
+            </w:r>
+          </w:p>
+        </w:tc>
+        <w:tc>
+          <w:tcPr>
+            <w:tcW w:type="dxa" w:w="7228"/>
+            <w:tcBorders>
+              <w:top w:val="single" w:color="999999" w:sz="4"/>
+              <w:left w:val="single" w:color="999999" w:sz="4"/>
+              <w:bottom w:val="single" w:color="999999" w:sz="4"/>
+              <w:right w:val="single" w:color="999999" w:sz="4"/>
+            </w:tcBorders>
+            <w:tcMar>
+              <w:top w:type="dxa" w:w="60"/>
+              <w:left w:type="dxa" w:w="100"/>
+              <w:bottom w:type="dxa" w:w="60"/>
+              <w:right w:type="dxa" w:w="100"/>
+            </w:tcMar>
+          </w:tcPr>
+          <w:p>
+            <w:r>
+              <w:t xml:space="preserve">Xong</w:t>
+            </w:r>
+          </w:p>
+        </w:tc>
+      </w:tr>
+    </w:tbl>
+    <w:p>
+      <w:pPr>
+        <w:spacing w:after="120"/>
+      </w:pPr>
+    </w:p>
+    <w:p>
+      <w:pPr>
+        <w:spacing w:after="120"/>
+      </w:pPr>
+      <w:r>
+        <w:rPr>
+          <w:b/>
+          <w:bCs/>
+        </w:rPr>
+        <w:t xml:space="preserve">Mục tiêu.</w:t>
+      </w:r>
+      <w:r>
+        <w:t xml:space="preserve"> Cho Receiver được chỉ định ghi kết quả kiểm tra chất lượng tại nơi nhận: Đạt thì lô sang </w:t>
+      </w:r>
+      <w:r>
+        <w:rPr>
+          <w:rFonts w:ascii="Consolas" w:cs="Consolas" w:eastAsia="Consolas" w:hAnsi="Consolas"/>
+          <w:sz w:val="22"/>
+          <w:szCs w:val="22"/>
+        </w:rPr>
+        <w:t xml:space="preserve">Released</w:t>
+      </w:r>
+      <w:r>
+        <w:t xml:space="preserve"> (được đưa vào sử dụng), Không đạt thì sang </w:t>
+      </w:r>
+      <w:r>
+        <w:rPr>
+          <w:rFonts w:ascii="Consolas" w:cs="Consolas" w:eastAsia="Consolas" w:hAnsi="Consolas"/>
+          <w:sz w:val="22"/>
+          <w:szCs w:val="22"/>
+        </w:rPr>
+        <w:t xml:space="preserve">Quarantined</w:t>
+      </w:r>
+      <w:r>
+        <w:t xml:space="preserve"> (biệt trữ). Đây là bước còn thiếu trong file kế hoạch Excel gốc.</w:t>
+      </w:r>
+    </w:p>
+    <w:p>
+      <w:pPr>
+        <w:spacing w:after="120"/>
+      </w:pPr>
+      <w:r>
+        <w:rPr>
+          <w:b/>
+          <w:bCs/>
+        </w:rPr>
+        <w:t xml:space="preserve">Đã làm:</w:t>
+      </w:r>
+    </w:p>
+    <w:p>
+      <w:pPr>
+        <w:pStyle w:val="ListParagraph"/>
+        <w:numPr>
+          <w:ilvl w:val="0"/>
+          <w:numId w:val="2"/>
+        </w:numPr>
+        <w:spacing w:after="60"/>
+      </w:pPr>
+      <w:r>
+        <w:t xml:space="preserve">Hàm </w:t>
+      </w:r>
+      <w:r>
+        <w:rPr>
+          <w:rFonts w:ascii="Consolas" w:cs="Consolas" w:eastAsia="Consolas" w:hAnsi="Consolas"/>
+          <w:sz w:val="22"/>
+          <w:szCs w:val="22"/>
+        </w:rPr>
+        <w:t xml:space="preserve">recordReceivingInspection(batchId, passed, reportNo, inspectDate, docHash)</w:t>
+      </w:r>
+      <w:r>
+        <w:t xml:space="preserve">.</w:t>
+      </w:r>
+    </w:p>
+    <w:p>
+      <w:pPr>
+        <w:pStyle w:val="ListParagraph"/>
+        <w:numPr>
+          <w:ilvl w:val="0"/>
+          <w:numId w:val="2"/>
+        </w:numPr>
+        <w:spacing w:after="60"/>
+      </w:pPr>
+      <w:r>
+        <w:t xml:space="preserve">Kiểm tra: đúng vai trò Receiver; lô tồn tại; lô đang ở </w:t>
+      </w:r>
+      <w:r>
+        <w:rPr>
+          <w:rFonts w:ascii="Consolas" w:cs="Consolas" w:eastAsia="Consolas" w:hAnsi="Consolas"/>
+          <w:sz w:val="22"/>
+          <w:szCs w:val="22"/>
+        </w:rPr>
+        <w:t xml:space="preserve">Received</w:t>
+      </w:r>
+      <w:r>
+        <w:t xml:space="preserve">; </w:t>
+      </w:r>
+      <w:r>
+        <w:rPr>
+          <w:rFonts w:ascii="Consolas" w:cs="Consolas" w:eastAsia="Consolas" w:hAnsi="Consolas"/>
+          <w:sz w:val="22"/>
+          <w:szCs w:val="22"/>
+        </w:rPr>
+        <w:t xml:space="preserve">docHash</w:t>
+      </w:r>
+      <w:r>
+        <w:t xml:space="preserve"> khác 0; người gọi đúng là Receiver được chỉ định ở Bước 4; số phiếu không rỗng; nếu Đạt thì lô chưa hết hạn.</w:t>
+      </w:r>
+    </w:p>
+    <w:p>
+      <w:pPr>
+        <w:pStyle w:val="ListParagraph"/>
+        <w:numPr>
+          <w:ilvl w:val="0"/>
+          <w:numId w:val="2"/>
+        </w:numPr>
+        <w:spacing w:after="60"/>
+      </w:pPr>
+      <w:r>
+        <w:t xml:space="preserve">Cập nhật trạng thái và phát event </w:t>
+      </w:r>
+      <w:r>
+        <w:rPr>
+          <w:rFonts w:ascii="Consolas" w:cs="Consolas" w:eastAsia="Consolas" w:hAnsi="Consolas"/>
+          <w:sz w:val="22"/>
+          <w:szCs w:val="22"/>
+        </w:rPr>
+        <w:t xml:space="preserve">ReceivingInspected</w:t>
+      </w:r>
+      <w:r>
+        <w:t xml:space="preserve">. </w:t>
+      </w:r>
+      <w:r>
+        <w:rPr>
+          <w:rFonts w:ascii="Consolas" w:cs="Consolas" w:eastAsia="Consolas" w:hAnsi="Consolas"/>
+          <w:sz w:val="22"/>
+          <w:szCs w:val="22"/>
+        </w:rPr>
+        <w:t xml:space="preserve">Released</w:t>
+      </w:r>
+      <w:r>
+        <w:t xml:space="preserve"> và </w:t>
+      </w:r>
+      <w:r>
+        <w:rPr>
+          <w:rFonts w:ascii="Consolas" w:cs="Consolas" w:eastAsia="Consolas" w:hAnsi="Consolas"/>
+          <w:sz w:val="22"/>
+          <w:szCs w:val="22"/>
+        </w:rPr>
+        <w:t xml:space="preserve">Quarantined</w:t>
+      </w:r>
+      <w:r>
+        <w:t xml:space="preserve"> là trạng thái kết thúc.</w:t>
+      </w:r>
+    </w:p>
+    <w:p>
+      <w:pPr>
+        <w:pStyle w:val="ListParagraph"/>
+        <w:numPr>
+          <w:ilvl w:val="0"/>
+          <w:numId w:val="2"/>
+        </w:numPr>
+        <w:spacing w:after="60"/>
+      </w:pPr>
+      <w:r>
+        <w:t xml:space="preserve">Với hàm này, contract đã đủ toàn bộ quy trình từ Bước 0 đến Bước 6 như proposal. Cập nhật bảng danh sách hàm theo từng bước trong README.</w:t>
+      </w:r>
+    </w:p>
+    <w:p>
+      <w:pPr>
+        <w:spacing w:after="120"/>
+      </w:pPr>
+      <w:r>
+        <w:rPr>
+          <w:b/>
+          <w:bCs/>
+        </w:rPr>
+        <w:t xml:space="preserve">Quyết định:</w:t>
+      </w:r>
+    </w:p>
+    <w:p>
+      <w:pPr>
+        <w:pStyle w:val="ListParagraph"/>
+        <w:numPr>
+          <w:ilvl w:val="0"/>
+          <w:numId w:val="2"/>
+        </w:numPr>
+        <w:spacing w:after="60"/>
+      </w:pPr>
+      <w:r>
+        <w:t xml:space="preserve">Giống Bước 2: chỉ ghi một lần nhờ máy trạng thái; lô hết hạn không được ghi Đạt nhưng vẫn được ghi Không đạt.</w:t>
+      </w:r>
+    </w:p>
+    <w:p>
+      <w:pPr>
+        <w:pStyle w:val="ListParagraph"/>
+        <w:numPr>
+          <w:ilvl w:val="0"/>
+          <w:numId w:val="2"/>
+        </w:numPr>
+        <w:spacing w:after="60"/>
+      </w:pPr>
+      <w:r>
+        <w:t xml:space="preserve">Kết hợp với quy tắc ở Bước 5 (cho xác nhận tiếp nhận lô hết hạn), lô hết hạn luôn có lối ra hợp lệ là </w:t>
+      </w:r>
+      <w:r>
+        <w:rPr>
+          <w:rFonts w:ascii="Consolas" w:cs="Consolas" w:eastAsia="Consolas" w:hAnsi="Consolas"/>
+          <w:sz w:val="22"/>
+          <w:szCs w:val="22"/>
+        </w:rPr>
+        <w:t xml:space="preserve">Quarantined</w:t>
+      </w:r>
+      <w:r>
+        <w:t xml:space="preserve">, không bị kẹt ở </w:t>
+      </w:r>
+      <w:r>
+        <w:rPr>
+          <w:rFonts w:ascii="Consolas" w:cs="Consolas" w:eastAsia="Consolas" w:hAnsi="Consolas"/>
+          <w:sz w:val="22"/>
+          <w:szCs w:val="22"/>
+        </w:rPr>
+        <w:t xml:space="preserve">Received</w:t>
+      </w:r>
+      <w:r>
+        <w:t xml:space="preserve">.</w:t>
+      </w:r>
+    </w:p>
+    <w:p>
+      <w:pPr>
+        <w:pStyle w:val="ListParagraph"/>
+        <w:numPr>
+          <w:ilvl w:val="0"/>
+          <w:numId w:val="2"/>
+        </w:numPr>
+        <w:spacing w:after="60"/>
+      </w:pPr>
+      <w:r>
+        <w:t xml:space="preserve">Không cần thêm thông báo lỗi mới: dùng lại </w:t>
+      </w:r>
+      <w:r>
+        <w:rPr>
+          <w:rFonts w:ascii="Consolas" w:cs="Consolas" w:eastAsia="Consolas" w:hAnsi="Consolas"/>
+          <w:sz w:val="22"/>
+          <w:szCs w:val="22"/>
+        </w:rPr>
+        <w:t xml:space="preserve">BR: not designated</w:t>
+      </w:r>
+      <w:r>
+        <w:t xml:space="preserve">, </w:t>
+      </w:r>
+      <w:r>
+        <w:rPr>
+          <w:rFonts w:ascii="Consolas" w:cs="Consolas" w:eastAsia="Consolas" w:hAnsi="Consolas"/>
+          <w:sz w:val="22"/>
+          <w:szCs w:val="22"/>
+        </w:rPr>
+        <w:t xml:space="preserve">BR: empty reportNo</w:t>
+      </w:r>
+      <w:r>
+        <w:t xml:space="preserve">, </w:t>
+      </w:r>
+      <w:r>
+        <w:rPr>
+          <w:rFonts w:ascii="Consolas" w:cs="Consolas" w:eastAsia="Consolas" w:hAnsi="Consolas"/>
+          <w:sz w:val="22"/>
+          <w:szCs w:val="22"/>
+        </w:rPr>
+        <w:t xml:space="preserve">BR: expired</w:t>
+      </w:r>
+      <w:r>
+        <w:t xml:space="preserve">.</w:t>
+      </w:r>
+    </w:p>
+    <w:p>
+      <w:pPr>
+        <w:spacing w:after="120"/>
+      </w:pPr>
+      <w:r>
+        <w:rPr>
+          <w:b/>
+          <w:bCs/>
+        </w:rPr>
+        <w:t xml:space="preserve">Bằng chứng / kết quả kiểm tra:</w:t>
+      </w:r>
+    </w:p>
+    <w:p>
+      <w:pPr>
+        <w:pStyle w:val="ListParagraph"/>
+        <w:numPr>
+          <w:ilvl w:val="0"/>
+          <w:numId w:val="2"/>
+        </w:numPr>
+        <w:spacing w:after="60"/>
+      </w:pPr>
+      <w:r>
+        <w:t xml:space="preserve">Biên dịch bằng solc 0.8.19 (EVM </w:t>
+      </w:r>
+      <w:r>
+        <w:rPr>
+          <w:rFonts w:ascii="Consolas" w:cs="Consolas" w:eastAsia="Consolas" w:hAnsi="Consolas"/>
+          <w:sz w:val="22"/>
+          <w:szCs w:val="22"/>
+        </w:rPr>
+        <w:t xml:space="preserve">paris</w:t>
+      </w:r>
+      <w:r>
+        <w:t xml:space="preserve">): không lỗi, không cảnh báo, không có opcode </w:t>
+      </w:r>
+      <w:r>
+        <w:rPr>
+          <w:rFonts w:ascii="Consolas" w:cs="Consolas" w:eastAsia="Consolas" w:hAnsi="Consolas"/>
+          <w:sz w:val="22"/>
+          <w:szCs w:val="22"/>
+        </w:rPr>
+        <w:t xml:space="preserve">PUSH0</w:t>
+      </w:r>
+      <w:r>
+        <w:t xml:space="preserve">. Bytecode khoảng 16,9 KB, dưới giới hạn 24 KB của EVM.</w:t>
+      </w:r>
+    </w:p>
+    <w:p>
+      <w:pPr>
+        <w:pStyle w:val="ListParagraph"/>
+        <w:numPr>
+          <w:ilvl w:val="0"/>
+          <w:numId w:val="2"/>
+        </w:numPr>
+        <w:spacing w:after="60"/>
+      </w:pPr>
+      <w:r>
+        <w:t xml:space="preserve">Chạy 28 kiểm tra trên chuỗi giả lập cục bộ: 28/28 đạt. Chạy lại các bộ của T06 (17), T07 (28), T08 (23), T09 (24), T10 (43) vẫn đạt toàn bộ.</w:t>
+      </w:r>
+    </w:p>
+    <w:p>
+      <w:pPr>
+        <w:pStyle w:val="ListParagraph"/>
+        <w:numPr>
+          <w:ilvl w:val="0"/>
+          <w:numId w:val="2"/>
+        </w:numPr>
+        <w:spacing w:after="60"/>
+      </w:pPr>
+      <w:r>
+        <w:t xml:space="preserve">Trường hợp đúng: Đạt sang </w:t>
+      </w:r>
+      <w:r>
+        <w:rPr>
+          <w:rFonts w:ascii="Consolas" w:cs="Consolas" w:eastAsia="Consolas" w:hAnsi="Consolas"/>
+          <w:sz w:val="22"/>
+          <w:szCs w:val="22"/>
+        </w:rPr>
+        <w:t xml:space="preserve">Released</w:t>
+      </w:r>
+      <w:r>
+        <w:t xml:space="preserve">, Không đạt sang </w:t>
+      </w:r>
+      <w:r>
+        <w:rPr>
+          <w:rFonts w:ascii="Consolas" w:cs="Consolas" w:eastAsia="Consolas" w:hAnsi="Consolas"/>
+          <w:sz w:val="22"/>
+          <w:szCs w:val="22"/>
+        </w:rPr>
+        <w:t xml:space="preserve">Quarantined</w:t>
+      </w:r>
+      <w:r>
+        <w:t xml:space="preserve">; event đủ trường; holder vẫn là Receiver.</w:t>
+      </w:r>
+    </w:p>
+    <w:p>
+      <w:pPr>
+        <w:pStyle w:val="ListParagraph"/>
+        <w:numPr>
+          <w:ilvl w:val="0"/>
+          <w:numId w:val="2"/>
+        </w:numPr>
+        <w:spacing w:after="60"/>
+      </w:pPr>
+      <w:r>
+        <w:t xml:space="preserve">Trạng thái kết thúc: ghi lại lô đã </w:t>
+      </w:r>
+      <w:r>
+        <w:rPr>
+          <w:rFonts w:ascii="Consolas" w:cs="Consolas" w:eastAsia="Consolas" w:hAnsi="Consolas"/>
+          <w:sz w:val="22"/>
+          <w:szCs w:val="22"/>
+        </w:rPr>
+        <w:t xml:space="preserve">Released</w:t>
+      </w:r>
+      <w:r>
+        <w:t xml:space="preserve"> hoặc </w:t>
+      </w:r>
+      <w:r>
+        <w:rPr>
+          <w:rFonts w:ascii="Consolas" w:cs="Consolas" w:eastAsia="Consolas" w:hAnsi="Consolas"/>
+          <w:sz w:val="22"/>
+          <w:szCs w:val="22"/>
+        </w:rPr>
+        <w:t xml:space="preserve">Quarantined</w:t>
+      </w:r>
+      <w:r>
+        <w:t xml:space="preserve"> đều bị từ chối; lô đã kết thúc không chuyển giao hay xác nhận lại được.</w:t>
+      </w:r>
+    </w:p>
+    <w:p>
+      <w:pPr>
+        <w:pStyle w:val="ListParagraph"/>
+        <w:numPr>
+          <w:ilvl w:val="0"/>
+          <w:numId w:val="2"/>
+        </w:numPr>
+        <w:spacing w:after="60"/>
+      </w:pPr>
+      <w:r>
+        <w:t xml:space="preserve">Sai trạng thái: lô còn ở </w:t>
+      </w:r>
+      <w:r>
+        <w:rPr>
+          <w:rFonts w:ascii="Consolas" w:cs="Consolas" w:eastAsia="Consolas" w:hAnsi="Consolas"/>
+          <w:sz w:val="22"/>
+          <w:szCs w:val="22"/>
+        </w:rPr>
+        <w:t xml:space="preserve">Imported</w:t>
+      </w:r>
+      <w:r>
+        <w:t xml:space="preserve"> hoặc </w:t>
+      </w:r>
+      <w:r>
+        <w:rPr>
+          <w:rFonts w:ascii="Consolas" w:cs="Consolas" w:eastAsia="Consolas" w:hAnsi="Consolas"/>
+          <w:sz w:val="22"/>
+          <w:szCs w:val="22"/>
+        </w:rPr>
+        <w:t xml:space="preserve">InTransfer</w:t>
+      </w:r>
+      <w:r>
+        <w:t xml:space="preserve"> bị từ chối. Sai người: Receiver khác, Receiver đã bị thu hồi, các vai trò khác. Sai dữ liệu: lô không tồn tại, hash bằng 0, số phiếu rỗng.</w:t>
+      </w:r>
+    </w:p>
+    <w:p>
+      <w:pPr>
+        <w:pStyle w:val="ListParagraph"/>
+        <w:numPr>
+          <w:ilvl w:val="0"/>
+          <w:numId w:val="2"/>
+        </w:numPr>
+        <w:spacing w:after="60"/>
+      </w:pPr>
+      <w:r>
+        <w:t xml:space="preserve">Hạn dùng: lô hết hạn ghi Đạt bị từ chối; cùng lô đó ghi Không đạt thì sang </w:t>
+      </w:r>
+      <w:r>
+        <w:rPr>
+          <w:rFonts w:ascii="Consolas" w:cs="Consolas" w:eastAsia="Consolas" w:hAnsi="Consolas"/>
+          <w:sz w:val="22"/>
+          <w:szCs w:val="22"/>
+        </w:rPr>
+        <w:t xml:space="preserve">Quarantined</w:t>
+      </w:r>
+      <w:r>
+        <w:t xml:space="preserve">.</w:t>
+      </w:r>
+    </w:p>
+    <w:p>
+      <w:pPr>
+        <w:pStyle w:val="ListParagraph"/>
+        <w:numPr>
+          <w:ilvl w:val="0"/>
+          <w:numId w:val="2"/>
+        </w:numPr>
+        <w:spacing w:after="60"/>
+      </w:pPr>
+      <w:r>
+        <w:rPr>
+          <w:b/>
+          <w:bCs/>
+        </w:rPr>
+        <w:t xml:space="preserve">Kiểm tra trọn vòng đời</w:t>
+      </w:r>
+      <w:r>
+        <w:t xml:space="preserve"> lô ví dụ PEN-K-20260901-001 (Penicillin G potassium) của proposal: lô có đủ 6 event từ </w:t>
+      </w:r>
+      <w:r>
+        <w:rPr>
+          <w:rFonts w:ascii="Consolas" w:cs="Consolas" w:eastAsia="Consolas" w:hAnsi="Consolas"/>
+          <w:sz w:val="22"/>
+          <w:szCs w:val="22"/>
+        </w:rPr>
+        <w:t xml:space="preserve">BatchRegistered</w:t>
+      </w:r>
+      <w:r>
+        <w:t xml:space="preserve"> đến </w:t>
+      </w:r>
+      <w:r>
+        <w:rPr>
+          <w:rFonts w:ascii="Consolas" w:cs="Consolas" w:eastAsia="Consolas" w:hAnsi="Consolas"/>
+          <w:sz w:val="22"/>
+          <w:szCs w:val="22"/>
+        </w:rPr>
+        <w:t xml:space="preserve">ReceivingInspected</w:t>
+      </w:r>
+      <w:r>
+        <w:t xml:space="preserve"> theo đúng thứ tự, mỗi event mang đúng hash hồ sơ của bước đó (COA, phiếu kiểm nghiệm, tờ khai, phiếu giao hàng, biên bản nhận hàng, phiếu kiểm tra tại nơi nhận). Đây là dữ liệu mà màn hình Truy xuất (T24) sẽ hiển thị.</w:t>
+      </w:r>
+    </w:p>
+    <w:p>
+      <w:pPr>
+        <w:pStyle w:val="ListParagraph"/>
+        <w:numPr>
+          <w:ilvl w:val="0"/>
+          <w:numId w:val="2"/>
+        </w:numPr>
+        <w:spacing w:after="60"/>
+      </w:pPr>
+      <w:r>
+        <w:t xml:space="preserve">Gas cho một lần </w:t>
+      </w:r>
+      <w:r>
+        <w:rPr>
+          <w:rFonts w:ascii="Consolas" w:cs="Consolas" w:eastAsia="Consolas" w:hAnsi="Consolas"/>
+          <w:sz w:val="22"/>
+          <w:szCs w:val="22"/>
+        </w:rPr>
+        <w:t xml:space="preserve">recordReceivingInspection</w:t>
+      </w:r>
+      <w:r>
+        <w:t xml:space="preserve">: khoảng 41.000.</w:t>
+      </w:r>
+    </w:p>
+    <w:p>
+      <w:pPr>
+        <w:spacing w:after="120"/>
+      </w:pPr>
+      <w:r>
+        <w:rPr>
+          <w:b/>
+          <w:bCs/>
+        </w:rPr>
+        <w:t xml:space="preserve">Còn lại / việc tiếp theo:</w:t>
+      </w:r>
+    </w:p>
+    <w:p>
+      <w:pPr>
+        <w:pStyle w:val="ListParagraph"/>
+        <w:numPr>
+          <w:ilvl w:val="0"/>
+          <w:numId w:val="2"/>
+        </w:numPr>
+        <w:spacing w:after="60"/>
+      </w:pPr>
+      <w:r>
+        <w:t xml:space="preserve">T11: rà lại các hàm đọc; cân nhắc thêm hàm trả danh sách lô cho DApp.</w:t>
+      </w:r>
+    </w:p>
+    <w:p>
+      <w:pPr>
+        <w:pStyle w:val="ListParagraph"/>
+        <w:numPr>
+          <w:ilvl w:val="0"/>
+          <w:numId w:val="2"/>
+        </w:numPr>
+        <w:spacing w:after="60"/>
+      </w:pPr>
+      <w:r>
+        <w:t xml:space="preserve">T12: gom các bộ kiểm thử đã chạy thành bộ ca kiểm thử chính thức trên Remix VM.</w:t>
+      </w:r>
+    </w:p>
+    <w:p>
+      <w:pPr>
+        <w:pStyle w:val="ListParagraph"/>
+        <w:numPr>
+          <w:ilvl w:val="0"/>
+          <w:numId w:val="2"/>
+        </w:numPr>
+        <w:spacing w:after="60"/>
+      </w:pPr>
+      <w:r>
+        <w:t xml:space="preserve">T13: rà soát toàn bộ contract trước khi deploy.</w:t>
       </w:r>
     </w:p>
     <w:p>

</xml_diff>

<commit_message>
Check hàm contract/ thêm  hàm danh sách lô theo trang
</commit_message>
<xml_diff>
--- a/docs/nhat-ky-trien-khai.docx
+++ b/docs/nhat-ky-trien-khai.docx
@@ -381,7 +381,7 @@
           </w:tcPr>
           <w:p>
             <w:r>
-              <w:t xml:space="preserve">6</w:t>
+              <w:t xml:space="preserve">7</w:t>
             </w:r>
           </w:p>
         </w:tc>
@@ -403,7 +403,7 @@
           </w:tcPr>
           <w:p>
             <w:r>
-              <w:t xml:space="preserve">T06–T10, T44 xong: contract đủ Bước 0 đến 6; còn T11–T13, T14 tùy chọn</w:t>
+              <w:t xml:space="preserve">T06–T11, T44 xong: contract đủ Bước 0 đến 6; còn T12, T13, T14 tùy chọn</w:t>
             </w:r>
           </w:p>
         </w:tc>
@@ -951,7 +951,7 @@
                 <w:b/>
                 <w:bCs/>
               </w:rPr>
-              <w:t xml:space="preserve">6</w:t>
+              <w:t xml:space="preserve">7</w:t>
             </w:r>
           </w:p>
         </w:tc>
@@ -7295,6 +7295,858 @@
       </w:pPr>
       <w:r>
         <w:t xml:space="preserve">T13: rà soát toàn bộ contract trước khi deploy.</w:t>
+      </w:r>
+    </w:p>
+    <w:p>
+      <w:pPr>
+        <w:pStyle w:val="Heading3"/>
+      </w:pPr>
+      <w:r>
+        <w:t xml:space="preserve">T11: Hàm đọc và danh sách lô</w:t>
+      </w:r>
+    </w:p>
+    <w:tbl>
+      <w:tblPr>
+        <w:tblW w:type="dxa" w:w="9638"/>
+        <w:tblBorders>
+          <w:top w:val="single" w:color="auto" w:sz="4"/>
+          <w:left w:val="single" w:color="auto" w:sz="4"/>
+          <w:bottom w:val="single" w:color="auto" w:sz="4"/>
+          <w:right w:val="single" w:color="auto" w:sz="4"/>
+          <w:insideH w:val="single" w:color="auto" w:sz="4"/>
+          <w:insideV w:val="single" w:color="auto" w:sz="4"/>
+        </w:tblBorders>
+      </w:tblPr>
+      <w:tblGrid>
+        <w:gridCol w:w="2410"/>
+        <w:gridCol w:w="7228"/>
+      </w:tblGrid>
+      <w:tr>
+        <w:trPr>
+          <w:tblHeader/>
+        </w:trPr>
+        <w:tc>
+          <w:tcPr>
+            <w:tcW w:type="dxa" w:w="2410"/>
+            <w:tcBorders>
+              <w:top w:val="single" w:color="999999" w:sz="4"/>
+              <w:left w:val="single" w:color="999999" w:sz="4"/>
+              <w:bottom w:val="single" w:color="999999" w:sz="4"/>
+              <w:right w:val="single" w:color="999999" w:sz="4"/>
+            </w:tcBorders>
+            <w:shd w:fill="D9E2F3" w:color="auto" w:val="clear"/>
+            <w:tcMar>
+              <w:top w:type="dxa" w:w="60"/>
+              <w:left w:type="dxa" w:w="100"/>
+              <w:bottom w:type="dxa" w:w="60"/>
+              <w:right w:type="dxa" w:w="100"/>
+            </w:tcMar>
+          </w:tcPr>
+          <w:p>
+            <w:r>
+              <w:rPr>
+                <w:b/>
+                <w:bCs/>
+              </w:rPr>
+              <w:t xml:space="preserve">Mục</w:t>
+            </w:r>
+          </w:p>
+        </w:tc>
+        <w:tc>
+          <w:tcPr>
+            <w:tcW w:type="dxa" w:w="7228"/>
+            <w:tcBorders>
+              <w:top w:val="single" w:color="999999" w:sz="4"/>
+              <w:left w:val="single" w:color="999999" w:sz="4"/>
+              <w:bottom w:val="single" w:color="999999" w:sz="4"/>
+              <w:right w:val="single" w:color="999999" w:sz="4"/>
+            </w:tcBorders>
+            <w:shd w:fill="D9E2F3" w:color="auto" w:val="clear"/>
+            <w:tcMar>
+              <w:top w:type="dxa" w:w="60"/>
+              <w:left w:type="dxa" w:w="100"/>
+              <w:bottom w:type="dxa" w:w="60"/>
+              <w:right w:type="dxa" w:w="100"/>
+            </w:tcMar>
+          </w:tcPr>
+          <w:p>
+            <w:r>
+              <w:rPr>
+                <w:b/>
+                <w:bCs/>
+              </w:rPr>
+              <w:t xml:space="preserve">Nội dung</w:t>
+            </w:r>
+          </w:p>
+        </w:tc>
+      </w:tr>
+      <w:tr>
+        <w:trPr>
+          <w:tblHeader w:val="false"/>
+        </w:trPr>
+        <w:tc>
+          <w:tcPr>
+            <w:tcW w:type="dxa" w:w="2410"/>
+            <w:tcBorders>
+              <w:top w:val="single" w:color="999999" w:sz="4"/>
+              <w:left w:val="single" w:color="999999" w:sz="4"/>
+              <w:bottom w:val="single" w:color="999999" w:sz="4"/>
+              <w:right w:val="single" w:color="999999" w:sz="4"/>
+            </w:tcBorders>
+            <w:tcMar>
+              <w:top w:type="dxa" w:w="60"/>
+              <w:left w:type="dxa" w:w="100"/>
+              <w:bottom w:type="dxa" w:w="60"/>
+              <w:right w:type="dxa" w:w="100"/>
+            </w:tcMar>
+          </w:tcPr>
+          <w:p>
+            <w:r>
+              <w:t xml:space="preserve">Ngày</w:t>
+            </w:r>
+          </w:p>
+        </w:tc>
+        <w:tc>
+          <w:tcPr>
+            <w:tcW w:type="dxa" w:w="7228"/>
+            <w:tcBorders>
+              <w:top w:val="single" w:color="999999" w:sz="4"/>
+              <w:left w:val="single" w:color="999999" w:sz="4"/>
+              <w:bottom w:val="single" w:color="999999" w:sz="4"/>
+              <w:right w:val="single" w:color="999999" w:sz="4"/>
+            </w:tcBorders>
+            <w:tcMar>
+              <w:top w:type="dxa" w:w="60"/>
+              <w:left w:type="dxa" w:w="100"/>
+              <w:bottom w:type="dxa" w:w="60"/>
+              <w:right w:type="dxa" w:w="100"/>
+            </w:tcMar>
+          </w:tcPr>
+          <w:p>
+            <w:r>
+              <w:t xml:space="preserve">20/10/2026</w:t>
+            </w:r>
+          </w:p>
+        </w:tc>
+      </w:tr>
+      <w:tr>
+        <w:trPr>
+          <w:tblHeader w:val="false"/>
+        </w:trPr>
+        <w:tc>
+          <w:tcPr>
+            <w:tcW w:type="dxa" w:w="2410"/>
+            <w:tcBorders>
+              <w:top w:val="single" w:color="999999" w:sz="4"/>
+              <w:left w:val="single" w:color="999999" w:sz="4"/>
+              <w:bottom w:val="single" w:color="999999" w:sz="4"/>
+              <w:right w:val="single" w:color="999999" w:sz="4"/>
+            </w:tcBorders>
+            <w:tcMar>
+              <w:top w:type="dxa" w:w="60"/>
+              <w:left w:type="dxa" w:w="100"/>
+              <w:bottom w:type="dxa" w:w="60"/>
+              <w:right w:type="dxa" w:w="100"/>
+            </w:tcMar>
+          </w:tcPr>
+          <w:p>
+            <w:r>
+              <w:t xml:space="preserve">Người thực hiện</w:t>
+            </w:r>
+          </w:p>
+        </w:tc>
+        <w:tc>
+          <w:tcPr>
+            <w:tcW w:type="dxa" w:w="7228"/>
+            <w:tcBorders>
+              <w:top w:val="single" w:color="999999" w:sz="4"/>
+              <w:left w:val="single" w:color="999999" w:sz="4"/>
+              <w:bottom w:val="single" w:color="999999" w:sz="4"/>
+              <w:right w:val="single" w:color="999999" w:sz="4"/>
+            </w:tcBorders>
+            <w:tcMar>
+              <w:top w:type="dxa" w:w="60"/>
+              <w:left w:type="dxa" w:w="100"/>
+              <w:bottom w:type="dxa" w:w="60"/>
+              <w:right w:type="dxa" w:w="100"/>
+            </w:tcMar>
+          </w:tcPr>
+          <w:p>
+            <w:r>
+              <w:t xml:space="preserve">Nguyễn Nhật Huy (với hỗ trợ của Claude)</w:t>
+            </w:r>
+          </w:p>
+        </w:tc>
+      </w:tr>
+      <w:tr>
+        <w:trPr>
+          <w:tblHeader w:val="false"/>
+        </w:trPr>
+        <w:tc>
+          <w:tcPr>
+            <w:tcW w:type="dxa" w:w="2410"/>
+            <w:tcBorders>
+              <w:top w:val="single" w:color="999999" w:sz="4"/>
+              <w:left w:val="single" w:color="999999" w:sz="4"/>
+              <w:bottom w:val="single" w:color="999999" w:sz="4"/>
+              <w:right w:val="single" w:color="999999" w:sz="4"/>
+            </w:tcBorders>
+            <w:tcMar>
+              <w:top w:type="dxa" w:w="60"/>
+              <w:left w:type="dxa" w:w="100"/>
+              <w:bottom w:type="dxa" w:w="60"/>
+              <w:right w:type="dxa" w:w="100"/>
+            </w:tcMar>
+          </w:tcPr>
+          <w:p>
+            <w:r>
+              <w:t xml:space="preserve">Trạng thái</w:t>
+            </w:r>
+          </w:p>
+        </w:tc>
+        <w:tc>
+          <w:tcPr>
+            <w:tcW w:type="dxa" w:w="7228"/>
+            <w:tcBorders>
+              <w:top w:val="single" w:color="999999" w:sz="4"/>
+              <w:left w:val="single" w:color="999999" w:sz="4"/>
+              <w:bottom w:val="single" w:color="999999" w:sz="4"/>
+              <w:right w:val="single" w:color="999999" w:sz="4"/>
+            </w:tcBorders>
+            <w:tcMar>
+              <w:top w:type="dxa" w:w="60"/>
+              <w:left w:type="dxa" w:w="100"/>
+              <w:bottom w:type="dxa" w:w="60"/>
+              <w:right w:type="dxa" w:w="100"/>
+            </w:tcMar>
+          </w:tcPr>
+          <w:p>
+            <w:r>
+              <w:t xml:space="preserve">Xong</w:t>
+            </w:r>
+          </w:p>
+        </w:tc>
+      </w:tr>
+    </w:tbl>
+    <w:p>
+      <w:pPr>
+        <w:spacing w:after="120"/>
+      </w:pPr>
+    </w:p>
+    <w:p>
+      <w:pPr>
+        <w:spacing w:after="120"/>
+      </w:pPr>
+      <w:r>
+        <w:rPr>
+          <w:b/>
+          <w:bCs/>
+        </w:rPr>
+        <w:t xml:space="preserve">Mục tiêu.</w:t>
+      </w:r>
+      <w:r>
+        <w:t xml:space="preserve"> Bảo đảm DApp đọc được thông tin và trạng thái của lô, kể cả danh sách lô, mà không tốn phí giao dịch.</w:t>
+      </w:r>
+    </w:p>
+    <w:p>
+      <w:pPr>
+        <w:spacing w:after="120"/>
+      </w:pPr>
+      <w:r>
+        <w:rPr>
+          <w:b/>
+          <w:bCs/>
+        </w:rPr>
+        <w:t xml:space="preserve">Đã làm:</w:t>
+      </w:r>
+    </w:p>
+    <w:p>
+      <w:pPr>
+        <w:pStyle w:val="ListParagraph"/>
+        <w:numPr>
+          <w:ilvl w:val="0"/>
+          <w:numId w:val="2"/>
+        </w:numPr>
+        <w:spacing w:after="60"/>
+      </w:pPr>
+      <w:r>
+        <w:t xml:space="preserve">Rà lại các hàm đọc đã có từ T06: </w:t>
+      </w:r>
+      <w:r>
+        <w:rPr>
+          <w:rFonts w:ascii="Consolas" w:cs="Consolas" w:eastAsia="Consolas" w:hAnsi="Consolas"/>
+          <w:sz w:val="22"/>
+          <w:szCs w:val="22"/>
+        </w:rPr>
+        <w:t xml:space="preserve">getRole</w:t>
+      </w:r>
+      <w:r>
+        <w:t xml:space="preserve">, </w:t>
+      </w:r>
+      <w:r>
+        <w:rPr>
+          <w:rFonts w:ascii="Consolas" w:cs="Consolas" w:eastAsia="Consolas" w:hAnsi="Consolas"/>
+          <w:sz w:val="22"/>
+          <w:szCs w:val="22"/>
+        </w:rPr>
+        <w:t xml:space="preserve">getBatch</w:t>
+      </w:r>
+      <w:r>
+        <w:t xml:space="preserve">, </w:t>
+      </w:r>
+      <w:r>
+        <w:rPr>
+          <w:rFonts w:ascii="Consolas" w:cs="Consolas" w:eastAsia="Consolas" w:hAnsi="Consolas"/>
+          <w:sz w:val="22"/>
+          <w:szCs w:val="22"/>
+        </w:rPr>
+        <w:t xml:space="preserve">getBatchCount</w:t>
+      </w:r>
+      <w:r>
+        <w:t xml:space="preserve">, </w:t>
+      </w:r>
+      <w:r>
+        <w:rPr>
+          <w:rFonts w:ascii="Consolas" w:cs="Consolas" w:eastAsia="Consolas" w:hAnsi="Consolas"/>
+          <w:sz w:val="22"/>
+          <w:szCs w:val="22"/>
+        </w:rPr>
+        <w:t xml:space="preserve">getBatchIdByNo</w:t>
+      </w:r>
+      <w:r>
+        <w:t xml:space="preserve">, </w:t>
+      </w:r>
+      <w:r>
+        <w:rPr>
+          <w:rFonts w:ascii="Consolas" w:cs="Consolas" w:eastAsia="Consolas" w:hAnsi="Consolas"/>
+          <w:sz w:val="22"/>
+          <w:szCs w:val="22"/>
+        </w:rPr>
+        <w:t xml:space="preserve">isExpired</w:t>
+      </w:r>
+      <w:r>
+        <w:t xml:space="preserve">.</w:t>
+      </w:r>
+    </w:p>
+    <w:p>
+      <w:pPr>
+        <w:pStyle w:val="ListParagraph"/>
+        <w:numPr>
+          <w:ilvl w:val="0"/>
+          <w:numId w:val="2"/>
+        </w:numPr>
+        <w:spacing w:after="60"/>
+      </w:pPr>
+      <w:r>
+        <w:t xml:space="preserve">Thêm </w:t>
+      </w:r>
+      <w:r>
+        <w:rPr>
+          <w:rFonts w:ascii="Consolas" w:cs="Consolas" w:eastAsia="Consolas" w:hAnsi="Consolas"/>
+          <w:sz w:val="22"/>
+          <w:szCs w:val="22"/>
+        </w:rPr>
+        <w:t xml:space="preserve">getBatches(fromId, count)</w:t>
+      </w:r>
+      <w:r>
+        <w:t xml:space="preserve">: trả một trang tối đa </w:t>
+      </w:r>
+      <w:r>
+        <w:rPr>
+          <w:rFonts w:ascii="Consolas" w:cs="Consolas" w:eastAsia="Consolas" w:hAnsi="Consolas"/>
+          <w:sz w:val="22"/>
+          <w:szCs w:val="22"/>
+        </w:rPr>
+        <w:t xml:space="preserve">count</w:t>
+      </w:r>
+      <w:r>
+        <w:t xml:space="preserve"> lô, bắt đầu từ </w:t>
+      </w:r>
+      <w:r>
+        <w:rPr>
+          <w:rFonts w:ascii="Consolas" w:cs="Consolas" w:eastAsia="Consolas" w:hAnsi="Consolas"/>
+          <w:sz w:val="22"/>
+          <w:szCs w:val="22"/>
+        </w:rPr>
+        <w:t xml:space="preserve">fromId</w:t>
+      </w:r>
+      <w:r>
+        <w:t xml:space="preserve">. Trả mảng rỗng nếu </w:t>
+      </w:r>
+      <w:r>
+        <w:rPr>
+          <w:rFonts w:ascii="Consolas" w:cs="Consolas" w:eastAsia="Consolas" w:hAnsi="Consolas"/>
+          <w:sz w:val="22"/>
+          <w:szCs w:val="22"/>
+        </w:rPr>
+        <w:t xml:space="preserve">fromId</w:t>
+      </w:r>
+      <w:r>
+        <w:t xml:space="preserve"> = 0, </w:t>
+      </w:r>
+      <w:r>
+        <w:rPr>
+          <w:rFonts w:ascii="Consolas" w:cs="Consolas" w:eastAsia="Consolas" w:hAnsi="Consolas"/>
+          <w:sz w:val="22"/>
+          <w:szCs w:val="22"/>
+        </w:rPr>
+        <w:t xml:space="preserve">fromId</w:t>
+      </w:r>
+      <w:r>
+        <w:t xml:space="preserve"> vượt số lô, hoặc </w:t>
+      </w:r>
+      <w:r>
+        <w:rPr>
+          <w:rFonts w:ascii="Consolas" w:cs="Consolas" w:eastAsia="Consolas" w:hAnsi="Consolas"/>
+          <w:sz w:val="22"/>
+          <w:szCs w:val="22"/>
+        </w:rPr>
+        <w:t xml:space="preserve">count</w:t>
+      </w:r>
+      <w:r>
+        <w:t xml:space="preserve"> = 0.</w:t>
+      </w:r>
+    </w:p>
+    <w:p>
+      <w:pPr>
+        <w:pStyle w:val="ListParagraph"/>
+        <w:numPr>
+          <w:ilvl w:val="0"/>
+          <w:numId w:val="2"/>
+        </w:numPr>
+        <w:spacing w:after="60"/>
+      </w:pPr>
+      <w:r>
+        <w:t xml:space="preserve">Bổ sung các hàm đọc vào bảng đặc tả ở mục 4 của </w:t>
+      </w:r>
+      <w:r>
+        <w:rPr>
+          <w:rFonts w:ascii="Consolas" w:cs="Consolas" w:eastAsia="Consolas" w:hAnsi="Consolas"/>
+          <w:sz w:val="22"/>
+          <w:szCs w:val="22"/>
+        </w:rPr>
+        <w:t xml:space="preserve">docs/design.md</w:t>
+      </w:r>
+      <w:r>
+        <w:t xml:space="preserve"> và vào bảng hàm trong README.</w:t>
+      </w:r>
+    </w:p>
+    <w:p>
+      <w:pPr>
+        <w:spacing w:after="120"/>
+      </w:pPr>
+      <w:r>
+        <w:rPr>
+          <w:b/>
+          <w:bCs/>
+        </w:rPr>
+        <w:t xml:space="preserve">Quyết định:</w:t>
+      </w:r>
+    </w:p>
+    <w:p>
+      <w:pPr>
+        <w:pStyle w:val="ListParagraph"/>
+        <w:numPr>
+          <w:ilvl w:val="0"/>
+          <w:numId w:val="2"/>
+        </w:numPr>
+        <w:spacing w:after="60"/>
+      </w:pPr>
+      <w:r>
+        <w:t xml:space="preserve">Phân trang thay vì trả toàn bộ lô một lần: mỗi lô có chuỗi </w:t>
+      </w:r>
+      <w:r>
+        <w:rPr>
+          <w:rFonts w:ascii="Consolas" w:cs="Consolas" w:eastAsia="Consolas" w:hAnsi="Consolas"/>
+          <w:sz w:val="22"/>
+          <w:szCs w:val="22"/>
+        </w:rPr>
+        <w:t xml:space="preserve">batchNo</w:t>
+      </w:r>
+      <w:r>
+        <w:t xml:space="preserve">, đọc quá nhiều lô trong một lần gọi có thể vượt giới hạn gas của </w:t>
+      </w:r>
+      <w:r>
+        <w:rPr>
+          <w:rFonts w:ascii="Consolas" w:cs="Consolas" w:eastAsia="Consolas" w:hAnsi="Consolas"/>
+          <w:sz w:val="22"/>
+          <w:szCs w:val="22"/>
+        </w:rPr>
+        <w:t xml:space="preserve">eth_call</w:t>
+      </w:r>
+      <w:r>
+        <w:t xml:space="preserve"> trên RPC công cộng. DApp nên đọc khoảng 50 lô mỗi trang.</w:t>
+      </w:r>
+    </w:p>
+    <w:p>
+      <w:pPr>
+        <w:pStyle w:val="ListParagraph"/>
+        <w:numPr>
+          <w:ilvl w:val="0"/>
+          <w:numId w:val="2"/>
+        </w:numPr>
+        <w:spacing w:after="60"/>
+      </w:pPr>
+      <w:r>
+        <w:t xml:space="preserve">Không thêm hàm lọc theo vai trò hay trạng thái trong contract. DApp tự lọc sau khi đọc danh sách (ví dụ: lô chờ Inspector là lô </w:t>
+      </w:r>
+      <w:r>
+        <w:rPr>
+          <w:rFonts w:ascii="Consolas" w:cs="Consolas" w:eastAsia="Consolas" w:hAnsi="Consolas"/>
+          <w:sz w:val="22"/>
+          <w:szCs w:val="22"/>
+        </w:rPr>
+        <w:t xml:space="preserve">Registered</w:t>
+      </w:r>
+      <w:r>
+        <w:t xml:space="preserve">), giúp contract gọn và tiết kiệm dung lượng bytecode.</w:t>
+      </w:r>
+    </w:p>
+    <w:p>
+      <w:pPr>
+        <w:spacing w:after="120"/>
+      </w:pPr>
+      <w:r>
+        <w:rPr>
+          <w:b/>
+          <w:bCs/>
+        </w:rPr>
+        <w:t xml:space="preserve">Vấn đề gặp phải và cách xử lý:</w:t>
+      </w:r>
+    </w:p>
+    <w:p>
+      <w:pPr>
+        <w:pStyle w:val="ListParagraph"/>
+        <w:numPr>
+          <w:ilvl w:val="0"/>
+          <w:numId w:val="2"/>
+        </w:numPr>
+        <w:spacing w:after="60"/>
+      </w:pPr>
+      <w:r>
+        <w:rPr>
+          <w:b/>
+          <w:bCs/>
+        </w:rPr>
+        <w:t xml:space="preserve">Số lô phân biệt chữ hoa và chữ thường</w:t>
+      </w:r>
+      <w:r>
+        <w:t xml:space="preserve">: contract băm nguyên văn chuỗi số lô, nên </w:t>
+      </w:r>
+      <w:r>
+        <w:rPr>
+          <w:rFonts w:ascii="Consolas" w:cs="Consolas" w:eastAsia="Consolas" w:hAnsi="Consolas"/>
+          <w:sz w:val="22"/>
+          <w:szCs w:val="22"/>
+        </w:rPr>
+        <w:t xml:space="preserve">LOT-007</w:t>
+      </w:r>
+      <w:r>
+        <w:t xml:space="preserve"> và </w:t>
+      </w:r>
+      <w:r>
+        <w:rPr>
+          <w:rFonts w:ascii="Consolas" w:cs="Consolas" w:eastAsia="Consolas" w:hAnsi="Consolas"/>
+          <w:sz w:val="22"/>
+          <w:szCs w:val="22"/>
+        </w:rPr>
+        <w:t xml:space="preserve">lot-007</w:t>
+      </w:r>
+      <w:r>
+        <w:t xml:space="preserve"> được coi là hai lô khác nhau và cả hai đều đăng ký được. Hướng xử lý cần chốt ở T13: hoặc DApp tự chuyển số lô sang chữ hoa trước khi gửi, hoặc contract từ chối chữ thường. Đã thêm vào tiêu chí của T13.</w:t>
+      </w:r>
+    </w:p>
+    <w:p>
+      <w:pPr>
+        <w:spacing w:after="120"/>
+      </w:pPr>
+      <w:r>
+        <w:rPr>
+          <w:b/>
+          <w:bCs/>
+        </w:rPr>
+        <w:t xml:space="preserve">Bằng chứng / kết quả kiểm tra:</w:t>
+      </w:r>
+    </w:p>
+    <w:p>
+      <w:pPr>
+        <w:pStyle w:val="ListParagraph"/>
+        <w:numPr>
+          <w:ilvl w:val="0"/>
+          <w:numId w:val="2"/>
+        </w:numPr>
+        <w:spacing w:after="60"/>
+      </w:pPr>
+      <w:r>
+        <w:t xml:space="preserve">Biên dịch bằng solc 0.8.19 (EVM </w:t>
+      </w:r>
+      <w:r>
+        <w:rPr>
+          <w:rFonts w:ascii="Consolas" w:cs="Consolas" w:eastAsia="Consolas" w:hAnsi="Consolas"/>
+          <w:sz w:val="22"/>
+          <w:szCs w:val="22"/>
+        </w:rPr>
+        <w:t xml:space="preserve">paris</w:t>
+      </w:r>
+      <w:r>
+        <w:t xml:space="preserve">): không lỗi, không cảnh báo, không có opcode </w:t>
+      </w:r>
+      <w:r>
+        <w:rPr>
+          <w:rFonts w:ascii="Consolas" w:cs="Consolas" w:eastAsia="Consolas" w:hAnsi="Consolas"/>
+          <w:sz w:val="22"/>
+          <w:szCs w:val="22"/>
+        </w:rPr>
+        <w:t xml:space="preserve">PUSH0</w:t>
+      </w:r>
+      <w:r>
+        <w:t xml:space="preserve">.</w:t>
+      </w:r>
+    </w:p>
+    <w:p>
+      <w:pPr>
+        <w:pStyle w:val="ListParagraph"/>
+        <w:numPr>
+          <w:ilvl w:val="0"/>
+          <w:numId w:val="2"/>
+        </w:numPr>
+        <w:spacing w:after="60"/>
+      </w:pPr>
+      <w:r>
+        <w:t xml:space="preserve">Chạy 23 kiểm tra trên chuỗi giả lập cục bộ: 23/23 đạt. Chạy lại các bộ của T06 (17), T07 (28), T08 (23), T09 (24), T10 (43), T44 (28) vẫn đạt toàn bộ.</w:t>
+      </w:r>
+    </w:p>
+    <w:p>
+      <w:pPr>
+        <w:pStyle w:val="ListParagraph"/>
+        <w:numPr>
+          <w:ilvl w:val="0"/>
+          <w:numId w:val="2"/>
+        </w:numPr>
+        <w:spacing w:after="60"/>
+      </w:pPr>
+      <w:r>
+        <w:t xml:space="preserve">Tạo 9 lô ở đủ 8 trạng thái từ </w:t>
+      </w:r>
+      <w:r>
+        <w:rPr>
+          <w:rFonts w:ascii="Consolas" w:cs="Consolas" w:eastAsia="Consolas" w:hAnsi="Consolas"/>
+          <w:sz w:val="22"/>
+          <w:szCs w:val="22"/>
+        </w:rPr>
+        <w:t xml:space="preserve">Registered</w:t>
+      </w:r>
+      <w:r>
+        <w:t xml:space="preserve"> đến </w:t>
+      </w:r>
+      <w:r>
+        <w:rPr>
+          <w:rFonts w:ascii="Consolas" w:cs="Consolas" w:eastAsia="Consolas" w:hAnsi="Consolas"/>
+          <w:sz w:val="22"/>
+          <w:szCs w:val="22"/>
+        </w:rPr>
+        <w:t xml:space="preserve">Quarantined</w:t>
+      </w:r>
+      <w:r>
+        <w:t xml:space="preserve">. </w:t>
+      </w:r>
+      <w:r>
+        <w:rPr>
+          <w:rFonts w:ascii="Consolas" w:cs="Consolas" w:eastAsia="Consolas" w:hAnsi="Consolas"/>
+          <w:sz w:val="22"/>
+          <w:szCs w:val="22"/>
+        </w:rPr>
+        <w:t xml:space="preserve">getBatch</w:t>
+      </w:r>
+      <w:r>
+        <w:t xml:space="preserve"> trả đúng trạng thái, người đang giữ và Receiver của từng lô; </w:t>
+      </w:r>
+      <w:r>
+        <w:rPr>
+          <w:rFonts w:ascii="Consolas" w:cs="Consolas" w:eastAsia="Consolas" w:hAnsi="Consolas"/>
+          <w:sz w:val="22"/>
+          <w:szCs w:val="22"/>
+        </w:rPr>
+        <w:t xml:space="preserve">getBatch(0)</w:t>
+      </w:r>
+      <w:r>
+        <w:t xml:space="preserve"> và lô vượt số lượng báo </w:t>
+      </w:r>
+      <w:r>
+        <w:rPr>
+          <w:rFonts w:ascii="Consolas" w:cs="Consolas" w:eastAsia="Consolas" w:hAnsi="Consolas"/>
+          <w:sz w:val="22"/>
+          <w:szCs w:val="22"/>
+        </w:rPr>
+        <w:t xml:space="preserve">BR: batch not found</w:t>
+      </w:r>
+      <w:r>
+        <w:t xml:space="preserve">.</w:t>
+      </w:r>
+    </w:p>
+    <w:p>
+      <w:pPr>
+        <w:pStyle w:val="ListParagraph"/>
+        <w:numPr>
+          <w:ilvl w:val="0"/>
+          <w:numId w:val="2"/>
+        </w:numPr>
+        <w:spacing w:after="60"/>
+      </w:pPr>
+      <w:r>
+        <w:t xml:space="preserve">Phân trang: chia 9 lô thành 3 trang 4 + 4 + 1, các trang nối nhau không trùng, không sót; dữ liệu khớp với </w:t>
+      </w:r>
+      <w:r>
+        <w:rPr>
+          <w:rFonts w:ascii="Consolas" w:cs="Consolas" w:eastAsia="Consolas" w:hAnsi="Consolas"/>
+          <w:sz w:val="22"/>
+          <w:szCs w:val="22"/>
+        </w:rPr>
+        <w:t xml:space="preserve">getBatch</w:t>
+      </w:r>
+      <w:r>
+        <w:t xml:space="preserve"> từng lô. </w:t>
+      </w:r>
+      <w:r>
+        <w:rPr>
+          <w:rFonts w:ascii="Consolas" w:cs="Consolas" w:eastAsia="Consolas" w:hAnsi="Consolas"/>
+          <w:sz w:val="22"/>
+          <w:szCs w:val="22"/>
+        </w:rPr>
+        <w:t xml:space="preserve">fromId</w:t>
+      </w:r>
+      <w:r>
+        <w:t xml:space="preserve"> = 0, </w:t>
+      </w:r>
+      <w:r>
+        <w:rPr>
+          <w:rFonts w:ascii="Consolas" w:cs="Consolas" w:eastAsia="Consolas" w:hAnsi="Consolas"/>
+          <w:sz w:val="22"/>
+          <w:szCs w:val="22"/>
+        </w:rPr>
+        <w:t xml:space="preserve">fromId</w:t>
+      </w:r>
+      <w:r>
+        <w:t xml:space="preserve"> vượt số lô, </w:t>
+      </w:r>
+      <w:r>
+        <w:rPr>
+          <w:rFonts w:ascii="Consolas" w:cs="Consolas" w:eastAsia="Consolas" w:hAnsi="Consolas"/>
+          <w:sz w:val="22"/>
+          <w:szCs w:val="22"/>
+        </w:rPr>
+        <w:t xml:space="preserve">count</w:t>
+      </w:r>
+      <w:r>
+        <w:t xml:space="preserve"> = 0 trả mảng rỗng; </w:t>
+      </w:r>
+      <w:r>
+        <w:rPr>
+          <w:rFonts w:ascii="Consolas" w:cs="Consolas" w:eastAsia="Consolas" w:hAnsi="Consolas"/>
+          <w:sz w:val="22"/>
+          <w:szCs w:val="22"/>
+        </w:rPr>
+        <w:t xml:space="preserve">count</w:t>
+      </w:r>
+      <w:r>
+        <w:t xml:space="preserve"> hoặc </w:t>
+      </w:r>
+      <w:r>
+        <w:rPr>
+          <w:rFonts w:ascii="Consolas" w:cs="Consolas" w:eastAsia="Consolas" w:hAnsi="Consolas"/>
+          <w:sz w:val="22"/>
+          <w:szCs w:val="22"/>
+        </w:rPr>
+        <w:t xml:space="preserve">fromId</w:t>
+      </w:r>
+      <w:r>
+        <w:t xml:space="preserve"> bằng giá trị lớn nhất của </w:t>
+      </w:r>
+      <w:r>
+        <w:rPr>
+          <w:rFonts w:ascii="Consolas" w:cs="Consolas" w:eastAsia="Consolas" w:hAnsi="Consolas"/>
+          <w:sz w:val="22"/>
+          <w:szCs w:val="22"/>
+        </w:rPr>
+        <w:t xml:space="preserve">uint256</w:t>
+      </w:r>
+      <w:r>
+        <w:t xml:space="preserve"> không gây lỗi tràn số.</w:t>
+      </w:r>
+    </w:p>
+    <w:p>
+      <w:pPr>
+        <w:pStyle w:val="ListParagraph"/>
+        <w:numPr>
+          <w:ilvl w:val="0"/>
+          <w:numId w:val="2"/>
+        </w:numPr>
+        <w:spacing w:after="60"/>
+      </w:pPr>
+      <w:r>
+        <w:t xml:space="preserve">Lọc phía DApp từ danh sách: tìm đúng các lô chờ Inspector và lô chờ Receiver xác nhận.</w:t>
+      </w:r>
+    </w:p>
+    <w:p>
+      <w:pPr>
+        <w:pStyle w:val="ListParagraph"/>
+        <w:numPr>
+          <w:ilvl w:val="0"/>
+          <w:numId w:val="2"/>
+        </w:numPr>
+        <w:spacing w:after="60"/>
+      </w:pPr>
+      <w:r>
+        <w:t xml:space="preserve">Gas ước tính khi đọc danh sách: khoảng 22.000 gas cho mỗi lô (đọc miễn phí, con số này chỉ dùng để ước lượng giới hạn của </w:t>
+      </w:r>
+      <w:r>
+        <w:rPr>
+          <w:rFonts w:ascii="Consolas" w:cs="Consolas" w:eastAsia="Consolas" w:hAnsi="Consolas"/>
+          <w:sz w:val="22"/>
+          <w:szCs w:val="22"/>
+        </w:rPr>
+        <w:t xml:space="preserve">eth_call</w:t>
+      </w:r>
+      <w:r>
+        <w:t xml:space="preserve">).</w:t>
+      </w:r>
+    </w:p>
+    <w:p>
+      <w:pPr>
+        <w:spacing w:after="120"/>
+      </w:pPr>
+      <w:r>
+        <w:rPr>
+          <w:b/>
+          <w:bCs/>
+        </w:rPr>
+        <w:t xml:space="preserve">Còn lại / việc tiếp theo:</w:t>
+      </w:r>
+    </w:p>
+    <w:p>
+      <w:pPr>
+        <w:pStyle w:val="ListParagraph"/>
+        <w:numPr>
+          <w:ilvl w:val="0"/>
+          <w:numId w:val="2"/>
+        </w:numPr>
+        <w:spacing w:after="60"/>
+      </w:pPr>
+      <w:r>
+        <w:t xml:space="preserve">T12: gom các bộ kiểm thử thành bộ ca kiểm thử chính thức.</w:t>
+      </w:r>
+    </w:p>
+    <w:p>
+      <w:pPr>
+        <w:pStyle w:val="ListParagraph"/>
+        <w:numPr>
+          <w:ilvl w:val="0"/>
+          <w:numId w:val="2"/>
+        </w:numPr>
+        <w:spacing w:after="60"/>
+      </w:pPr>
+      <w:r>
+        <w:t xml:space="preserve">T13: rà soát toàn bộ contract, chốt cách xử lý số lô chữ hoa/thường.</w:t>
       </w:r>
     </w:p>
     <w:p>

</xml_diff>

<commit_message>
chạy kiểm thử trên Remix/sửa khung contract
</commit_message>
<xml_diff>
--- a/docs/nhat-ky-trien-khai.docx
+++ b/docs/nhat-ky-trien-khai.docx
@@ -65,7 +65,7 @@
         <w:t xml:space="preserve">Cập nhật lần cuối:</w:t>
       </w:r>
       <w:r>
-        <w:t xml:space="preserve"> 20/10/2026.</w:t>
+        <w:t xml:space="preserve"> 23/10/2026.</w:t>
       </w:r>
     </w:p>
     <w:p>
@@ -381,7 +381,7 @@
           </w:tcPr>
           <w:p>
             <w:r>
-              <w:t xml:space="preserve">8</w:t>
+              <w:t xml:space="preserve">10</w:t>
             </w:r>
           </w:p>
         </w:tc>
@@ -403,7 +403,7 @@
           </w:tcPr>
           <w:p>
             <w:r>
-              <w:t xml:space="preserve">T06–T12, T44 xong; 147/147 kiểm tra đạt; còn T13, T14 tùy chọn</w:t>
+              <w:t xml:space="preserve">Xong toàn bộ (T06–T14, T44); 172/172 kiểm tra đạt; sẵn sàng deploy</w:t>
             </w:r>
           </w:p>
         </w:tc>
@@ -951,7 +951,7 @@
                 <w:b/>
                 <w:bCs/>
               </w:rPr>
-              <w:t xml:space="preserve">8</w:t>
+              <w:t xml:space="preserve">10</w:t>
             </w:r>
           </w:p>
         </w:tc>
@@ -8826,6 +8826,1199 @@
       </w:pPr>
       <w:r>
         <w:t xml:space="preserve">T13: rà soát toàn bộ contract, chốt cách xử lý số lô chữ hoa/thường.</w:t>
+      </w:r>
+    </w:p>
+    <w:p>
+      <w:pPr>
+        <w:pStyle w:val="Heading3"/>
+      </w:pPr>
+      <w:r>
+        <w:t xml:space="preserve">T13: Rà soát contract trước khi deploy</w:t>
+      </w:r>
+    </w:p>
+    <w:tbl>
+      <w:tblPr>
+        <w:tblW w:type="dxa" w:w="9638"/>
+        <w:tblBorders>
+          <w:top w:val="single" w:color="auto" w:sz="4"/>
+          <w:left w:val="single" w:color="auto" w:sz="4"/>
+          <w:bottom w:val="single" w:color="auto" w:sz="4"/>
+          <w:right w:val="single" w:color="auto" w:sz="4"/>
+          <w:insideH w:val="single" w:color="auto" w:sz="4"/>
+          <w:insideV w:val="single" w:color="auto" w:sz="4"/>
+        </w:tblBorders>
+      </w:tblPr>
+      <w:tblGrid>
+        <w:gridCol w:w="2410"/>
+        <w:gridCol w:w="7228"/>
+      </w:tblGrid>
+      <w:tr>
+        <w:trPr>
+          <w:tblHeader/>
+        </w:trPr>
+        <w:tc>
+          <w:tcPr>
+            <w:tcW w:type="dxa" w:w="2410"/>
+            <w:tcBorders>
+              <w:top w:val="single" w:color="999999" w:sz="4"/>
+              <w:left w:val="single" w:color="999999" w:sz="4"/>
+              <w:bottom w:val="single" w:color="999999" w:sz="4"/>
+              <w:right w:val="single" w:color="999999" w:sz="4"/>
+            </w:tcBorders>
+            <w:shd w:fill="D9E2F3" w:color="auto" w:val="clear"/>
+            <w:tcMar>
+              <w:top w:type="dxa" w:w="60"/>
+              <w:left w:type="dxa" w:w="100"/>
+              <w:bottom w:type="dxa" w:w="60"/>
+              <w:right w:type="dxa" w:w="100"/>
+            </w:tcMar>
+          </w:tcPr>
+          <w:p>
+            <w:r>
+              <w:rPr>
+                <w:b/>
+                <w:bCs/>
+              </w:rPr>
+              <w:t xml:space="preserve">Mục</w:t>
+            </w:r>
+          </w:p>
+        </w:tc>
+        <w:tc>
+          <w:tcPr>
+            <w:tcW w:type="dxa" w:w="7228"/>
+            <w:tcBorders>
+              <w:top w:val="single" w:color="999999" w:sz="4"/>
+              <w:left w:val="single" w:color="999999" w:sz="4"/>
+              <w:bottom w:val="single" w:color="999999" w:sz="4"/>
+              <w:right w:val="single" w:color="999999" w:sz="4"/>
+            </w:tcBorders>
+            <w:shd w:fill="D9E2F3" w:color="auto" w:val="clear"/>
+            <w:tcMar>
+              <w:top w:type="dxa" w:w="60"/>
+              <w:left w:type="dxa" w:w="100"/>
+              <w:bottom w:type="dxa" w:w="60"/>
+              <w:right w:type="dxa" w:w="100"/>
+            </w:tcMar>
+          </w:tcPr>
+          <w:p>
+            <w:r>
+              <w:rPr>
+                <w:b/>
+                <w:bCs/>
+              </w:rPr>
+              <w:t xml:space="preserve">Nội dung</w:t>
+            </w:r>
+          </w:p>
+        </w:tc>
+      </w:tr>
+      <w:tr>
+        <w:trPr>
+          <w:tblHeader w:val="false"/>
+        </w:trPr>
+        <w:tc>
+          <w:tcPr>
+            <w:tcW w:type="dxa" w:w="2410"/>
+            <w:tcBorders>
+              <w:top w:val="single" w:color="999999" w:sz="4"/>
+              <w:left w:val="single" w:color="999999" w:sz="4"/>
+              <w:bottom w:val="single" w:color="999999" w:sz="4"/>
+              <w:right w:val="single" w:color="999999" w:sz="4"/>
+            </w:tcBorders>
+            <w:tcMar>
+              <w:top w:type="dxa" w:w="60"/>
+              <w:left w:type="dxa" w:w="100"/>
+              <w:bottom w:type="dxa" w:w="60"/>
+              <w:right w:type="dxa" w:w="100"/>
+            </w:tcMar>
+          </w:tcPr>
+          <w:p>
+            <w:r>
+              <w:t xml:space="preserve">Ngày</w:t>
+            </w:r>
+          </w:p>
+        </w:tc>
+        <w:tc>
+          <w:tcPr>
+            <w:tcW w:type="dxa" w:w="7228"/>
+            <w:tcBorders>
+              <w:top w:val="single" w:color="999999" w:sz="4"/>
+              <w:left w:val="single" w:color="999999" w:sz="4"/>
+              <w:bottom w:val="single" w:color="999999" w:sz="4"/>
+              <w:right w:val="single" w:color="999999" w:sz="4"/>
+            </w:tcBorders>
+            <w:tcMar>
+              <w:top w:type="dxa" w:w="60"/>
+              <w:left w:type="dxa" w:w="100"/>
+              <w:bottom w:type="dxa" w:w="60"/>
+              <w:right w:type="dxa" w:w="100"/>
+            </w:tcMar>
+          </w:tcPr>
+          <w:p>
+            <w:r>
+              <w:t xml:space="preserve">23/10/2026</w:t>
+            </w:r>
+          </w:p>
+        </w:tc>
+      </w:tr>
+      <w:tr>
+        <w:trPr>
+          <w:tblHeader w:val="false"/>
+        </w:trPr>
+        <w:tc>
+          <w:tcPr>
+            <w:tcW w:type="dxa" w:w="2410"/>
+            <w:tcBorders>
+              <w:top w:val="single" w:color="999999" w:sz="4"/>
+              <w:left w:val="single" w:color="999999" w:sz="4"/>
+              <w:bottom w:val="single" w:color="999999" w:sz="4"/>
+              <w:right w:val="single" w:color="999999" w:sz="4"/>
+            </w:tcBorders>
+            <w:tcMar>
+              <w:top w:type="dxa" w:w="60"/>
+              <w:left w:type="dxa" w:w="100"/>
+              <w:bottom w:type="dxa" w:w="60"/>
+              <w:right w:type="dxa" w:w="100"/>
+            </w:tcMar>
+          </w:tcPr>
+          <w:p>
+            <w:r>
+              <w:t xml:space="preserve">Người thực hiện</w:t>
+            </w:r>
+          </w:p>
+        </w:tc>
+        <w:tc>
+          <w:tcPr>
+            <w:tcW w:type="dxa" w:w="7228"/>
+            <w:tcBorders>
+              <w:top w:val="single" w:color="999999" w:sz="4"/>
+              <w:left w:val="single" w:color="999999" w:sz="4"/>
+              <w:bottom w:val="single" w:color="999999" w:sz="4"/>
+              <w:right w:val="single" w:color="999999" w:sz="4"/>
+            </w:tcBorders>
+            <w:tcMar>
+              <w:top w:type="dxa" w:w="60"/>
+              <w:left w:type="dxa" w:w="100"/>
+              <w:bottom w:type="dxa" w:w="60"/>
+              <w:right w:type="dxa" w:w="100"/>
+            </w:tcMar>
+          </w:tcPr>
+          <w:p>
+            <w:r>
+              <w:t xml:space="preserve">Nguyễn Nhật Huy (với hỗ trợ của Claude)</w:t>
+            </w:r>
+          </w:p>
+        </w:tc>
+      </w:tr>
+      <w:tr>
+        <w:trPr>
+          <w:tblHeader w:val="false"/>
+        </w:trPr>
+        <w:tc>
+          <w:tcPr>
+            <w:tcW w:type="dxa" w:w="2410"/>
+            <w:tcBorders>
+              <w:top w:val="single" w:color="999999" w:sz="4"/>
+              <w:left w:val="single" w:color="999999" w:sz="4"/>
+              <w:bottom w:val="single" w:color="999999" w:sz="4"/>
+              <w:right w:val="single" w:color="999999" w:sz="4"/>
+            </w:tcBorders>
+            <w:tcMar>
+              <w:top w:type="dxa" w:w="60"/>
+              <w:left w:type="dxa" w:w="100"/>
+              <w:bottom w:type="dxa" w:w="60"/>
+              <w:right w:type="dxa" w:w="100"/>
+            </w:tcMar>
+          </w:tcPr>
+          <w:p>
+            <w:r>
+              <w:t xml:space="preserve">Trạng thái</w:t>
+            </w:r>
+          </w:p>
+        </w:tc>
+        <w:tc>
+          <w:tcPr>
+            <w:tcW w:type="dxa" w:w="7228"/>
+            <w:tcBorders>
+              <w:top w:val="single" w:color="999999" w:sz="4"/>
+              <w:left w:val="single" w:color="999999" w:sz="4"/>
+              <w:bottom w:val="single" w:color="999999" w:sz="4"/>
+              <w:right w:val="single" w:color="999999" w:sz="4"/>
+            </w:tcBorders>
+            <w:tcMar>
+              <w:top w:type="dxa" w:w="60"/>
+              <w:left w:type="dxa" w:w="100"/>
+              <w:bottom w:type="dxa" w:w="60"/>
+              <w:right w:type="dxa" w:w="100"/>
+            </w:tcMar>
+          </w:tcPr>
+          <w:p>
+            <w:r>
+              <w:t xml:space="preserve">Xong</w:t>
+            </w:r>
+          </w:p>
+        </w:tc>
+      </w:tr>
+    </w:tbl>
+    <w:p>
+      <w:pPr>
+        <w:spacing w:after="120"/>
+      </w:pPr>
+    </w:p>
+    <w:p>
+      <w:pPr>
+        <w:spacing w:after="120"/>
+      </w:pPr>
+      <w:r>
+        <w:rPr>
+          <w:b/>
+          <w:bCs/>
+        </w:rPr>
+        <w:t xml:space="preserve">Mục tiêu.</w:t>
+      </w:r>
+      <w:r>
+        <w:t xml:space="preserve"> Rà toàn bộ contract trước khi deploy lên RSK Testnet, vì sau khi deploy không sửa được nữa.</w:t>
+      </w:r>
+    </w:p>
+    <w:p>
+      <w:pPr>
+        <w:spacing w:after="120"/>
+      </w:pPr>
+      <w:r>
+        <w:rPr>
+          <w:b/>
+          <w:bCs/>
+        </w:rPr>
+        <w:t xml:space="preserve">Đã làm:</w:t>
+      </w:r>
+    </w:p>
+    <w:p>
+      <w:pPr>
+        <w:pStyle w:val="ListParagraph"/>
+        <w:numPr>
+          <w:ilvl w:val="0"/>
+          <w:numId w:val="2"/>
+        </w:numPr>
+        <w:spacing w:after="60"/>
+      </w:pPr>
+      <w:r>
+        <w:t xml:space="preserve">Rà các điều kiện quyền, trạng thái và hạn dùng của từng hàm; rà các rủi ro bảo mật phổ biến.</w:t>
+      </w:r>
+    </w:p>
+    <w:p>
+      <w:pPr>
+        <w:pStyle w:val="ListParagraph"/>
+        <w:numPr>
+          <w:ilvl w:val="0"/>
+          <w:numId w:val="2"/>
+        </w:numPr>
+        <w:spacing w:after="60"/>
+      </w:pPr>
+      <w:r>
+        <w:rPr>
+          <w:b/>
+          <w:bCs/>
+        </w:rPr>
+        <w:t xml:space="preserve">Số lô:</w:t>
+      </w:r>
+      <w:r>
+        <w:t xml:space="preserve"> thêm kiểm tra định dạng: chỉ gồm A–Z, 0–9 và các ký tự </w:t>
+      </w:r>
+      <w:r>
+        <w:rPr>
+          <w:rFonts w:ascii="Consolas" w:cs="Consolas" w:eastAsia="Consolas" w:hAnsi="Consolas"/>
+          <w:sz w:val="22"/>
+          <w:szCs w:val="22"/>
+        </w:rPr>
+        <w:t xml:space="preserve">- _ / .</w:t>
+      </w:r>
+      <w:r>
+        <w:t xml:space="preserve">, tối đa 32 ký tự (lỗi mới </w:t>
+      </w:r>
+      <w:r>
+        <w:rPr>
+          <w:rFonts w:ascii="Consolas" w:cs="Consolas" w:eastAsia="Consolas" w:hAnsi="Consolas"/>
+          <w:sz w:val="22"/>
+          <w:szCs w:val="22"/>
+        </w:rPr>
+        <w:t xml:space="preserve">BR: invalid batchNo</w:t>
+      </w:r>
+      <w:r>
+        <w:t xml:space="preserve">). DApp sẽ tự đổi số lô sang chữ hoa trước khi gửi.</w:t>
+      </w:r>
+    </w:p>
+    <w:p>
+      <w:pPr>
+        <w:pStyle w:val="ListParagraph"/>
+        <w:numPr>
+          <w:ilvl w:val="0"/>
+          <w:numId w:val="2"/>
+        </w:numPr>
+        <w:spacing w:after="60"/>
+      </w:pPr>
+      <w:r>
+        <w:rPr>
+          <w:b/>
+          <w:bCs/>
+        </w:rPr>
+        <w:t xml:space="preserve">Ngày do người dùng nhập</w:t>
+      </w:r>
+      <w:r>
+        <w:t xml:space="preserve"> (ngày sản xuất, kiểm nghiệm, nhập khẩu, kiểm tra tại nơi nhận): phải khác 0 và không sau thời điểm ghi (lỗi mới </w:t>
+      </w:r>
+      <w:r>
+        <w:rPr>
+          <w:rFonts w:ascii="Consolas" w:cs="Consolas" w:eastAsia="Consolas" w:hAnsi="Consolas"/>
+          <w:sz w:val="22"/>
+          <w:szCs w:val="22"/>
+        </w:rPr>
+        <w:t xml:space="preserve">BR: invalid date</w:t>
+      </w:r>
+      <w:r>
+        <w:t xml:space="preserve">).</w:t>
+      </w:r>
+    </w:p>
+    <w:p>
+      <w:pPr>
+        <w:pStyle w:val="ListParagraph"/>
+        <w:numPr>
+          <w:ilvl w:val="0"/>
+          <w:numId w:val="2"/>
+        </w:numPr>
+        <w:spacing w:after="60"/>
+      </w:pPr>
+      <w:r>
+        <w:t xml:space="preserve">Cập nhật </w:t>
+      </w:r>
+      <w:r>
+        <w:rPr>
+          <w:rFonts w:ascii="Consolas" w:cs="Consolas" w:eastAsia="Consolas" w:hAnsi="Consolas"/>
+          <w:sz w:val="22"/>
+          <w:szCs w:val="22"/>
+        </w:rPr>
+        <w:t xml:space="preserve">docs/design.md</w:t>
+      </w:r>
+      <w:r>
+        <w:t xml:space="preserve"> (quyết định D11, D12, đặc tả hàm, quy tắc hạn dùng, bảng lỗi) và brief UI/UX giao cho nhóm thiết kế.</w:t>
+      </w:r>
+    </w:p>
+    <w:p>
+      <w:pPr>
+        <w:spacing w:after="120"/>
+      </w:pPr>
+      <w:r>
+        <w:rPr>
+          <w:b/>
+          <w:bCs/>
+        </w:rPr>
+        <w:t xml:space="preserve">Quyết định:</w:t>
+      </w:r>
+    </w:p>
+    <w:p>
+      <w:pPr>
+        <w:pStyle w:val="ListParagraph"/>
+        <w:numPr>
+          <w:ilvl w:val="0"/>
+          <w:numId w:val="2"/>
+        </w:numPr>
+        <w:spacing w:after="60"/>
+      </w:pPr>
+      <w:r>
+        <w:t xml:space="preserve">Nhóm chọn kiểm tra định dạng số lô ngay trong contract thay vì chỉ ở DApp, để người gọi thẳng contract (Remix, script) cũng không tạo được hai lô "PEN-001" và "pen-001".</w:t>
+      </w:r>
+    </w:p>
+    <w:p>
+      <w:pPr>
+        <w:pStyle w:val="ListParagraph"/>
+        <w:numPr>
+          <w:ilvl w:val="0"/>
+          <w:numId w:val="2"/>
+        </w:numPr>
+        <w:spacing w:after="60"/>
+      </w:pPr>
+      <w:r>
+        <w:t xml:space="preserve">Giới hạn số lô 32 ký tự để chi phí đọc danh sách lô (</w:t>
+      </w:r>
+      <w:r>
+        <w:rPr>
+          <w:rFonts w:ascii="Consolas" w:cs="Consolas" w:eastAsia="Consolas" w:hAnsi="Consolas"/>
+          <w:sz w:val="22"/>
+          <w:szCs w:val="22"/>
+        </w:rPr>
+        <w:t xml:space="preserve">getBatches</w:t>
+      </w:r>
+      <w:r>
+        <w:t xml:space="preserve">) có giới hạn.</w:t>
+      </w:r>
+    </w:p>
+    <w:p>
+      <w:pPr>
+        <w:pStyle w:val="ListParagraph"/>
+        <w:numPr>
+          <w:ilvl w:val="0"/>
+          <w:numId w:val="2"/>
+        </w:numPr>
+        <w:spacing w:after="60"/>
+      </w:pPr>
+      <w:r>
+        <w:t xml:space="preserve">Lô hết hạn khi đang ở </w:t>
+      </w:r>
+      <w:r>
+        <w:rPr>
+          <w:rFonts w:ascii="Consolas" w:cs="Consolas" w:eastAsia="Consolas" w:hAnsi="Consolas"/>
+          <w:sz w:val="22"/>
+          <w:szCs w:val="22"/>
+        </w:rPr>
+        <w:t xml:space="preserve">Tested</w:t>
+      </w:r>
+      <w:r>
+        <w:t xml:space="preserve"> hoặc </w:t>
+      </w:r>
+      <w:r>
+        <w:rPr>
+          <w:rFonts w:ascii="Consolas" w:cs="Consolas" w:eastAsia="Consolas" w:hAnsi="Consolas"/>
+          <w:sz w:val="22"/>
+          <w:szCs w:val="22"/>
+        </w:rPr>
+        <w:t xml:space="preserve">Imported</w:t>
+      </w:r>
+      <w:r>
+        <w:t xml:space="preserve"> sẽ dừng tại chỗ, không có trạng thái kết thúc riêng. Nhóm chấp nhận vì thực tế lô nằm lại kho và được xử lý ngoài hệ thống; DApp gắn nhãn "Đã hết hạn".</w:t>
+      </w:r>
+    </w:p>
+    <w:p>
+      <w:pPr>
+        <w:spacing w:after="120"/>
+      </w:pPr>
+      <w:r>
+        <w:rPr>
+          <w:b/>
+          <w:bCs/>
+        </w:rPr>
+        <w:t xml:space="preserve">Vấn đề gặp phải và cách xử lý:</w:t>
+      </w:r>
+    </w:p>
+    <w:p>
+      <w:pPr>
+        <w:pStyle w:val="ListParagraph"/>
+        <w:numPr>
+          <w:ilvl w:val="0"/>
+          <w:numId w:val="2"/>
+        </w:numPr>
+        <w:spacing w:after="60"/>
+      </w:pPr>
+      <w:r>
+        <w:t xml:space="preserve">Phát hiện mục 5 của </w:t>
+      </w:r>
+      <w:r>
+        <w:rPr>
+          <w:rFonts w:ascii="Consolas" w:cs="Consolas" w:eastAsia="Consolas" w:hAnsi="Consolas"/>
+          <w:sz w:val="22"/>
+          <w:szCs w:val="22"/>
+        </w:rPr>
+        <w:t xml:space="preserve">docs/design.md</w:t>
+      </w:r>
+      <w:r>
+        <w:t xml:space="preserve"> ghi sai rằng lô hết hạn "luôn có lối ra hợp lệ"; thực tế chỉ đúng với lô ở </w:t>
+      </w:r>
+      <w:r>
+        <w:rPr>
+          <w:rFonts w:ascii="Consolas" w:cs="Consolas" w:eastAsia="Consolas" w:hAnsi="Consolas"/>
+          <w:sz w:val="22"/>
+          <w:szCs w:val="22"/>
+        </w:rPr>
+        <w:t xml:space="preserve">Registered</w:t>
+      </w:r>
+      <w:r>
+        <w:t xml:space="preserve">, </w:t>
+      </w:r>
+      <w:r>
+        <w:rPr>
+          <w:rFonts w:ascii="Consolas" w:cs="Consolas" w:eastAsia="Consolas" w:hAnsi="Consolas"/>
+          <w:sz w:val="22"/>
+          <w:szCs w:val="22"/>
+        </w:rPr>
+        <w:t xml:space="preserve">InTransfer</w:t>
+      </w:r>
+      <w:r>
+        <w:t xml:space="preserve">, </w:t>
+      </w:r>
+      <w:r>
+        <w:rPr>
+          <w:rFonts w:ascii="Consolas" w:cs="Consolas" w:eastAsia="Consolas" w:hAnsi="Consolas"/>
+          <w:sz w:val="22"/>
+          <w:szCs w:val="22"/>
+        </w:rPr>
+        <w:t xml:space="preserve">Received</w:t>
+      </w:r>
+      <w:r>
+        <w:t xml:space="preserve">. Đã sửa lại tài liệu cho đúng.</w:t>
+      </w:r>
+    </w:p>
+    <w:p>
+      <w:pPr>
+        <w:pStyle w:val="ListParagraph"/>
+        <w:numPr>
+          <w:ilvl w:val="0"/>
+          <w:numId w:val="2"/>
+        </w:numPr>
+        <w:spacing w:after="60"/>
+      </w:pPr>
+      <w:r>
+        <w:t xml:space="preserve">Không tìm thấy lỗi bảo mật nghiêm trọng: contract không gọi ra contract ngoài (không có rủi ro reentrancy), Solidity 0.8 tự kiểm tra tràn số, vòng lặp duy nhất (</w:t>
+      </w:r>
+      <w:r>
+        <w:rPr>
+          <w:rFonts w:ascii="Consolas" w:cs="Consolas" w:eastAsia="Consolas" w:hAnsi="Consolas"/>
+          <w:sz w:val="22"/>
+          <w:szCs w:val="22"/>
+        </w:rPr>
+        <w:t xml:space="preserve">getBatches</w:t>
+      </w:r>
+      <w:r>
+        <w:t xml:space="preserve">) có giới hạn theo tham số.</w:t>
+      </w:r>
+    </w:p>
+    <w:p>
+      <w:pPr>
+        <w:pStyle w:val="ListParagraph"/>
+        <w:numPr>
+          <w:ilvl w:val="0"/>
+          <w:numId w:val="2"/>
+        </w:numPr>
+        <w:spacing w:after="60"/>
+      </w:pPr>
+      <w:r>
+        <w:t xml:space="preserve">Rủi ro còn lại được ghi nhận: chỉ có một Admin (ví deploy); mất khóa ví Admin thì không cấp được vai trò mới. Chấp nhận được với mô hình thử nghiệm.</w:t>
+      </w:r>
+    </w:p>
+    <w:p>
+      <w:pPr>
+        <w:spacing w:after="120"/>
+      </w:pPr>
+      <w:r>
+        <w:rPr>
+          <w:b/>
+          <w:bCs/>
+        </w:rPr>
+        <w:t xml:space="preserve">Bằng chứng / kết quả kiểm tra:</w:t>
+      </w:r>
+    </w:p>
+    <w:p>
+      <w:pPr>
+        <w:pStyle w:val="ListParagraph"/>
+        <w:numPr>
+          <w:ilvl w:val="0"/>
+          <w:numId w:val="2"/>
+        </w:numPr>
+        <w:spacing w:after="60"/>
+      </w:pPr>
+      <w:r>
+        <w:rPr>
+          <w:rFonts w:ascii="Consolas" w:cs="Consolas" w:eastAsia="Consolas" w:hAnsi="Consolas"/>
+          <w:sz w:val="22"/>
+          <w:szCs w:val="22"/>
+        </w:rPr>
+        <w:t xml:space="preserve">npm run test:report</w:t>
+      </w:r>
+      <w:r>
+        <w:t xml:space="preserve">: </w:t>
+      </w:r>
+      <w:r>
+        <w:rPr>
+          <w:b/>
+          <w:bCs/>
+        </w:rPr>
+        <w:t xml:space="preserve">172/172</w:t>
+      </w:r>
+      <w:r>
+        <w:t xml:space="preserve"> kiểm tra đạt, </w:t>
+      </w:r>
+      <w:r>
+        <w:rPr>
+          <w:b/>
+          <w:bCs/>
+        </w:rPr>
+        <w:t xml:space="preserve">37/37</w:t>
+      </w:r>
+      <w:r>
+        <w:t xml:space="preserve"> ca đại diện đạt (thêm TC36 số lô chữ thường, TC37 ngày không hợp lệ). 147 kiểm tra cũ vẫn đạt sau khi sửa.</w:t>
+      </w:r>
+    </w:p>
+    <w:p>
+      <w:pPr>
+        <w:pStyle w:val="ListParagraph"/>
+        <w:numPr>
+          <w:ilvl w:val="0"/>
+          <w:numId w:val="2"/>
+        </w:numPr>
+        <w:spacing w:after="60"/>
+      </w:pPr>
+      <w:r>
+        <w:t xml:space="preserve">Bytecode runtime 20.142 byte (giới hạn 24.576 byte), không có opcode </w:t>
+      </w:r>
+      <w:r>
+        <w:rPr>
+          <w:rFonts w:ascii="Consolas" w:cs="Consolas" w:eastAsia="Consolas" w:hAnsi="Consolas"/>
+          <w:sz w:val="22"/>
+          <w:szCs w:val="22"/>
+        </w:rPr>
+        <w:t xml:space="preserve">PUSH0</w:t>
+      </w:r>
+      <w:r>
+        <w:t xml:space="preserve">.</w:t>
+      </w:r>
+    </w:p>
+    <w:p>
+      <w:pPr>
+        <w:pStyle w:val="ListParagraph"/>
+        <w:numPr>
+          <w:ilvl w:val="0"/>
+          <w:numId w:val="2"/>
+        </w:numPr>
+        <w:spacing w:after="60"/>
+      </w:pPr>
+      <w:r>
+        <w:t xml:space="preserve">Kịch bản 14 bước trên Remix (</w:t>
+      </w:r>
+      <w:r>
+        <w:rPr>
+          <w:rFonts w:ascii="Consolas" w:cs="Consolas" w:eastAsia="Consolas" w:hAnsi="Consolas"/>
+          <w:sz w:val="22"/>
+          <w:szCs w:val="22"/>
+        </w:rPr>
+        <w:t xml:space="preserve">docs/remix-testing.md</w:t>
+      </w:r>
+      <w:r>
+        <w:t xml:space="preserve">) chạy lại vẫn đúng.</w:t>
+      </w:r>
+    </w:p>
+    <w:p>
+      <w:pPr>
+        <w:spacing w:after="120"/>
+      </w:pPr>
+      <w:r>
+        <w:rPr>
+          <w:b/>
+          <w:bCs/>
+        </w:rPr>
+        <w:t xml:space="preserve">Còn lại / việc tiếp theo:</w:t>
+      </w:r>
+    </w:p>
+    <w:p>
+      <w:pPr>
+        <w:pStyle w:val="ListParagraph"/>
+        <w:numPr>
+          <w:ilvl w:val="0"/>
+          <w:numId w:val="2"/>
+        </w:numPr>
+        <w:spacing w:after="60"/>
+      </w:pPr>
+      <w:r>
+        <w:t xml:space="preserve">T15: deploy lên RSK Testnet, sau khi xong T02–T04 (ví, tRBTC, thử Remix).</w:t>
+      </w:r>
+    </w:p>
+    <w:p>
+      <w:pPr>
+        <w:pStyle w:val="Heading3"/>
+      </w:pPr>
+      <w:r>
+        <w:t xml:space="preserve">T14: cancelTransfer (hủy chuyển giao)</w:t>
+      </w:r>
+    </w:p>
+    <w:tbl>
+      <w:tblPr>
+        <w:tblW w:type="dxa" w:w="9638"/>
+        <w:tblBorders>
+          <w:top w:val="single" w:color="auto" w:sz="4"/>
+          <w:left w:val="single" w:color="auto" w:sz="4"/>
+          <w:bottom w:val="single" w:color="auto" w:sz="4"/>
+          <w:right w:val="single" w:color="auto" w:sz="4"/>
+          <w:insideH w:val="single" w:color="auto" w:sz="4"/>
+          <w:insideV w:val="single" w:color="auto" w:sz="4"/>
+        </w:tblBorders>
+      </w:tblPr>
+      <w:tblGrid>
+        <w:gridCol w:w="2410"/>
+        <w:gridCol w:w="7228"/>
+      </w:tblGrid>
+      <w:tr>
+        <w:trPr>
+          <w:tblHeader/>
+        </w:trPr>
+        <w:tc>
+          <w:tcPr>
+            <w:tcW w:type="dxa" w:w="2410"/>
+            <w:tcBorders>
+              <w:top w:val="single" w:color="999999" w:sz="4"/>
+              <w:left w:val="single" w:color="999999" w:sz="4"/>
+              <w:bottom w:val="single" w:color="999999" w:sz="4"/>
+              <w:right w:val="single" w:color="999999" w:sz="4"/>
+            </w:tcBorders>
+            <w:shd w:fill="D9E2F3" w:color="auto" w:val="clear"/>
+            <w:tcMar>
+              <w:top w:type="dxa" w:w="60"/>
+              <w:left w:type="dxa" w:w="100"/>
+              <w:bottom w:type="dxa" w:w="60"/>
+              <w:right w:type="dxa" w:w="100"/>
+            </w:tcMar>
+          </w:tcPr>
+          <w:p>
+            <w:r>
+              <w:rPr>
+                <w:b/>
+                <w:bCs/>
+              </w:rPr>
+              <w:t xml:space="preserve">Mục</w:t>
+            </w:r>
+          </w:p>
+        </w:tc>
+        <w:tc>
+          <w:tcPr>
+            <w:tcW w:type="dxa" w:w="7228"/>
+            <w:tcBorders>
+              <w:top w:val="single" w:color="999999" w:sz="4"/>
+              <w:left w:val="single" w:color="999999" w:sz="4"/>
+              <w:bottom w:val="single" w:color="999999" w:sz="4"/>
+              <w:right w:val="single" w:color="999999" w:sz="4"/>
+            </w:tcBorders>
+            <w:shd w:fill="D9E2F3" w:color="auto" w:val="clear"/>
+            <w:tcMar>
+              <w:top w:type="dxa" w:w="60"/>
+              <w:left w:type="dxa" w:w="100"/>
+              <w:bottom w:type="dxa" w:w="60"/>
+              <w:right w:type="dxa" w:w="100"/>
+            </w:tcMar>
+          </w:tcPr>
+          <w:p>
+            <w:r>
+              <w:rPr>
+                <w:b/>
+                <w:bCs/>
+              </w:rPr>
+              <w:t xml:space="preserve">Nội dung</w:t>
+            </w:r>
+          </w:p>
+        </w:tc>
+      </w:tr>
+      <w:tr>
+        <w:trPr>
+          <w:tblHeader w:val="false"/>
+        </w:trPr>
+        <w:tc>
+          <w:tcPr>
+            <w:tcW w:type="dxa" w:w="2410"/>
+            <w:tcBorders>
+              <w:top w:val="single" w:color="999999" w:sz="4"/>
+              <w:left w:val="single" w:color="999999" w:sz="4"/>
+              <w:bottom w:val="single" w:color="999999" w:sz="4"/>
+              <w:right w:val="single" w:color="999999" w:sz="4"/>
+            </w:tcBorders>
+            <w:tcMar>
+              <w:top w:type="dxa" w:w="60"/>
+              <w:left w:type="dxa" w:w="100"/>
+              <w:bottom w:type="dxa" w:w="60"/>
+              <w:right w:type="dxa" w:w="100"/>
+            </w:tcMar>
+          </w:tcPr>
+          <w:p>
+            <w:r>
+              <w:t xml:space="preserve">Ngày</w:t>
+            </w:r>
+          </w:p>
+        </w:tc>
+        <w:tc>
+          <w:tcPr>
+            <w:tcW w:type="dxa" w:w="7228"/>
+            <w:tcBorders>
+              <w:top w:val="single" w:color="999999" w:sz="4"/>
+              <w:left w:val="single" w:color="999999" w:sz="4"/>
+              <w:bottom w:val="single" w:color="999999" w:sz="4"/>
+              <w:right w:val="single" w:color="999999" w:sz="4"/>
+            </w:tcBorders>
+            <w:tcMar>
+              <w:top w:type="dxa" w:w="60"/>
+              <w:left w:type="dxa" w:w="100"/>
+              <w:bottom w:type="dxa" w:w="60"/>
+              <w:right w:type="dxa" w:w="100"/>
+            </w:tcMar>
+          </w:tcPr>
+          <w:p>
+            <w:r>
+              <w:t xml:space="preserve">23/10/2026</w:t>
+            </w:r>
+          </w:p>
+        </w:tc>
+      </w:tr>
+      <w:tr>
+        <w:trPr>
+          <w:tblHeader w:val="false"/>
+        </w:trPr>
+        <w:tc>
+          <w:tcPr>
+            <w:tcW w:type="dxa" w:w="2410"/>
+            <w:tcBorders>
+              <w:top w:val="single" w:color="999999" w:sz="4"/>
+              <w:left w:val="single" w:color="999999" w:sz="4"/>
+              <w:bottom w:val="single" w:color="999999" w:sz="4"/>
+              <w:right w:val="single" w:color="999999" w:sz="4"/>
+            </w:tcBorders>
+            <w:tcMar>
+              <w:top w:type="dxa" w:w="60"/>
+              <w:left w:type="dxa" w:w="100"/>
+              <w:bottom w:type="dxa" w:w="60"/>
+              <w:right w:type="dxa" w:w="100"/>
+            </w:tcMar>
+          </w:tcPr>
+          <w:p>
+            <w:r>
+              <w:t xml:space="preserve">Người thực hiện</w:t>
+            </w:r>
+          </w:p>
+        </w:tc>
+        <w:tc>
+          <w:tcPr>
+            <w:tcW w:type="dxa" w:w="7228"/>
+            <w:tcBorders>
+              <w:top w:val="single" w:color="999999" w:sz="4"/>
+              <w:left w:val="single" w:color="999999" w:sz="4"/>
+              <w:bottom w:val="single" w:color="999999" w:sz="4"/>
+              <w:right w:val="single" w:color="999999" w:sz="4"/>
+            </w:tcBorders>
+            <w:tcMar>
+              <w:top w:type="dxa" w:w="60"/>
+              <w:left w:type="dxa" w:w="100"/>
+              <w:bottom w:type="dxa" w:w="60"/>
+              <w:right w:type="dxa" w:w="100"/>
+            </w:tcMar>
+          </w:tcPr>
+          <w:p>
+            <w:r>
+              <w:t xml:space="preserve">Nguyễn Nhật Huy (với hỗ trợ của Claude)</w:t>
+            </w:r>
+          </w:p>
+        </w:tc>
+      </w:tr>
+      <w:tr>
+        <w:trPr>
+          <w:tblHeader w:val="false"/>
+        </w:trPr>
+        <w:tc>
+          <w:tcPr>
+            <w:tcW w:type="dxa" w:w="2410"/>
+            <w:tcBorders>
+              <w:top w:val="single" w:color="999999" w:sz="4"/>
+              <w:left w:val="single" w:color="999999" w:sz="4"/>
+              <w:bottom w:val="single" w:color="999999" w:sz="4"/>
+              <w:right w:val="single" w:color="999999" w:sz="4"/>
+            </w:tcBorders>
+            <w:tcMar>
+              <w:top w:type="dxa" w:w="60"/>
+              <w:left w:type="dxa" w:w="100"/>
+              <w:bottom w:type="dxa" w:w="60"/>
+              <w:right w:type="dxa" w:w="100"/>
+            </w:tcMar>
+          </w:tcPr>
+          <w:p>
+            <w:r>
+              <w:t xml:space="preserve">Trạng thái</w:t>
+            </w:r>
+          </w:p>
+        </w:tc>
+        <w:tc>
+          <w:tcPr>
+            <w:tcW w:type="dxa" w:w="7228"/>
+            <w:tcBorders>
+              <w:top w:val="single" w:color="999999" w:sz="4"/>
+              <w:left w:val="single" w:color="999999" w:sz="4"/>
+              <w:bottom w:val="single" w:color="999999" w:sz="4"/>
+              <w:right w:val="single" w:color="999999" w:sz="4"/>
+            </w:tcBorders>
+            <w:tcMar>
+              <w:top w:type="dxa" w:w="60"/>
+              <w:left w:type="dxa" w:w="100"/>
+              <w:bottom w:type="dxa" w:w="60"/>
+              <w:right w:type="dxa" w:w="100"/>
+            </w:tcMar>
+          </w:tcPr>
+          <w:p>
+            <w:r>
+              <w:t xml:space="preserve">Xong</w:t>
+            </w:r>
+          </w:p>
+        </w:tc>
+      </w:tr>
+    </w:tbl>
+    <w:p>
+      <w:pPr>
+        <w:spacing w:after="120"/>
+      </w:pPr>
+    </w:p>
+    <w:p>
+      <w:pPr>
+        <w:spacing w:after="120"/>
+      </w:pPr>
+      <w:r>
+        <w:rPr>
+          <w:b/>
+          <w:bCs/>
+        </w:rPr>
+        <w:t xml:space="preserve">Mục tiêu.</w:t>
+      </w:r>
+      <w:r>
+        <w:t xml:space="preserve"> Xử lý rủi ro ghi nhận ở T10: lô kẹt vĩnh viễn ở </w:t>
+      </w:r>
+      <w:r>
+        <w:rPr>
+          <w:rFonts w:ascii="Consolas" w:cs="Consolas" w:eastAsia="Consolas" w:hAnsi="Consolas"/>
+          <w:sz w:val="22"/>
+          <w:szCs w:val="22"/>
+        </w:rPr>
+        <w:t xml:space="preserve">InTransfer</w:t>
+      </w:r>
+      <w:r>
+        <w:t xml:space="preserve"> khi Receiver bị thu hồi vai trò hoặc không bao giờ xác nhận.</w:t>
+      </w:r>
+    </w:p>
+    <w:p>
+      <w:pPr>
+        <w:spacing w:after="120"/>
+      </w:pPr>
+      <w:r>
+        <w:rPr>
+          <w:b/>
+          <w:bCs/>
+        </w:rPr>
+        <w:t xml:space="preserve">Đã làm:</w:t>
+      </w:r>
+    </w:p>
+    <w:p>
+      <w:pPr>
+        <w:pStyle w:val="ListParagraph"/>
+        <w:numPr>
+          <w:ilvl w:val="0"/>
+          <w:numId w:val="2"/>
+        </w:numPr>
+        <w:spacing w:after="60"/>
+      </w:pPr>
+      <w:r>
+        <w:t xml:space="preserve">Hàm </w:t>
+      </w:r>
+      <w:r>
+        <w:rPr>
+          <w:rFonts w:ascii="Consolas" w:cs="Consolas" w:eastAsia="Consolas" w:hAnsi="Consolas"/>
+          <w:sz w:val="22"/>
+          <w:szCs w:val="22"/>
+        </w:rPr>
+        <w:t xml:space="preserve">cancelTransfer(batchId, docHash)</w:t>
+      </w:r>
+      <w:r>
+        <w:t xml:space="preserve">: chỉ Importer được chỉ định, lô đang </w:t>
+      </w:r>
+      <w:r>
+        <w:rPr>
+          <w:rFonts w:ascii="Consolas" w:cs="Consolas" w:eastAsia="Consolas" w:hAnsi="Consolas"/>
+          <w:sz w:val="22"/>
+          <w:szCs w:val="22"/>
+        </w:rPr>
+        <w:t xml:space="preserve">InTransfer</w:t>
+      </w:r>
+      <w:r>
+        <w:t xml:space="preserve">; </w:t>
+      </w:r>
+      <w:r>
+        <w:rPr>
+          <w:rFonts w:ascii="Consolas" w:cs="Consolas" w:eastAsia="Consolas" w:hAnsi="Consolas"/>
+          <w:sz w:val="22"/>
+          <w:szCs w:val="22"/>
+        </w:rPr>
+        <w:t xml:space="preserve">docHash</w:t>
+      </w:r>
+      <w:r>
+        <w:t xml:space="preserve"> là hash biên bản hủy giao.</w:t>
+      </w:r>
+    </w:p>
+    <w:p>
+      <w:pPr>
+        <w:pStyle w:val="ListParagraph"/>
+        <w:numPr>
+          <w:ilvl w:val="0"/>
+          <w:numId w:val="2"/>
+        </w:numPr>
+        <w:spacing w:after="60"/>
+      </w:pPr>
+      <w:r>
+        <w:t xml:space="preserve">Lô quay về </w:t>
+      </w:r>
+      <w:r>
+        <w:rPr>
+          <w:rFonts w:ascii="Consolas" w:cs="Consolas" w:eastAsia="Consolas" w:hAnsi="Consolas"/>
+          <w:sz w:val="22"/>
+          <w:szCs w:val="22"/>
+        </w:rPr>
+        <w:t xml:space="preserve">Imported</w:t>
+      </w:r>
+      <w:r>
+        <w:t xml:space="preserve">, xóa Receiver đã chỉ định, người giữ lô vẫn là Importer; phát event </w:t>
+      </w:r>
+      <w:r>
+        <w:rPr>
+          <w:rFonts w:ascii="Consolas" w:cs="Consolas" w:eastAsia="Consolas" w:hAnsi="Consolas"/>
+          <w:sz w:val="22"/>
+          <w:szCs w:val="22"/>
+        </w:rPr>
+        <w:t xml:space="preserve">TransferCancelled</w:t>
+      </w:r>
+      <w:r>
+        <w:t xml:space="preserve"> ghi lại Receiver cũ.</w:t>
+      </w:r>
+    </w:p>
+    <w:p>
+      <w:pPr>
+        <w:pStyle w:val="ListParagraph"/>
+        <w:numPr>
+          <w:ilvl w:val="0"/>
+          <w:numId w:val="2"/>
+        </w:numPr>
+        <w:spacing w:after="60"/>
+      </w:pPr>
+      <w:r>
+        <w:t xml:space="preserve">Sau khi hủy, Importer giao lại được cho Receiver khác.</w:t>
+      </w:r>
+    </w:p>
+    <w:p>
+      <w:pPr>
+        <w:spacing w:after="120"/>
+      </w:pPr>
+      <w:r>
+        <w:rPr>
+          <w:b/>
+          <w:bCs/>
+        </w:rPr>
+        <w:t xml:space="preserve">Quyết định:</w:t>
+      </w:r>
+    </w:p>
+    <w:p>
+      <w:pPr>
+        <w:pStyle w:val="ListParagraph"/>
+        <w:numPr>
+          <w:ilvl w:val="0"/>
+          <w:numId w:val="2"/>
+        </w:numPr>
+        <w:spacing w:after="60"/>
+      </w:pPr>
+      <w:r>
+        <w:t xml:space="preserve">Nhóm quyết định làm T14 (vốn là việc "nếu dư thời gian") trước khi deploy, vì deploy rồi thì không thêm hàm được nữa.</w:t>
+      </w:r>
+    </w:p>
+    <w:p>
+      <w:pPr>
+        <w:pStyle w:val="ListParagraph"/>
+        <w:numPr>
+          <w:ilvl w:val="0"/>
+          <w:numId w:val="2"/>
+        </w:numPr>
+        <w:spacing w:after="60"/>
+      </w:pPr>
+      <w:r>
+        <w:t xml:space="preserve">Chỉ bên khởi tạo (Importer được chỉ định) được hủy; Receiver không hủy được, Receiver chỉ cần không xác nhận.</w:t>
+      </w:r>
+    </w:p>
+    <w:p>
+      <w:pPr>
+        <w:pStyle w:val="ListParagraph"/>
+        <w:numPr>
+          <w:ilvl w:val="0"/>
+          <w:numId w:val="2"/>
+        </w:numPr>
+        <w:spacing w:after="60"/>
+      </w:pPr>
+      <w:r>
+        <w:t xml:space="preserve">Không chặn hủy với lô đã hết hạn: hủy là lối thoát khỏi </w:t>
+      </w:r>
+      <w:r>
+        <w:rPr>
+          <w:rFonts w:ascii="Consolas" w:cs="Consolas" w:eastAsia="Consolas" w:hAnsi="Consolas"/>
+          <w:sz w:val="22"/>
+          <w:szCs w:val="22"/>
+        </w:rPr>
+        <w:t xml:space="preserve">InTransfer</w:t>
+      </w:r>
+      <w:r>
+        <w:t xml:space="preserve">, không đẩy lô tiến lên.</w:t>
+      </w:r>
+    </w:p>
+    <w:p>
+      <w:pPr>
+        <w:spacing w:after="120"/>
+      </w:pPr>
+      <w:r>
+        <w:rPr>
+          <w:b/>
+          <w:bCs/>
+        </w:rPr>
+        <w:t xml:space="preserve">Bằng chứng / kết quả kiểm tra:</w:t>
+      </w:r>
+    </w:p>
+    <w:p>
+      <w:pPr>
+        <w:pStyle w:val="ListParagraph"/>
+        <w:numPr>
+          <w:ilvl w:val="0"/>
+          <w:numId w:val="2"/>
+        </w:numPr>
+        <w:spacing w:after="60"/>
+      </w:pPr>
+      <w:r>
+        <w:t xml:space="preserve">Thêm 11 kiểm tra vào nhóm Chuyển giao, gồm TC35: Receiver bị thu hồi, Importer hủy, lô về </w:t>
+      </w:r>
+      <w:r>
+        <w:rPr>
+          <w:rFonts w:ascii="Consolas" w:cs="Consolas" w:eastAsia="Consolas" w:hAnsi="Consolas"/>
+          <w:sz w:val="22"/>
+          <w:szCs w:val="22"/>
+        </w:rPr>
+        <w:t xml:space="preserve">Imported</w:t>
+      </w:r>
+      <w:r>
+        <w:t xml:space="preserve">, event ghi Receiver cũ, rồi giao lại cho Receiver khác và được xác nhận.</w:t>
+      </w:r>
+    </w:p>
+    <w:p>
+      <w:pPr>
+        <w:pStyle w:val="ListParagraph"/>
+        <w:numPr>
+          <w:ilvl w:val="0"/>
+          <w:numId w:val="2"/>
+        </w:numPr>
+        <w:spacing w:after="60"/>
+      </w:pPr>
+      <w:r>
+        <w:t xml:space="preserve">Bị từ chối đúng khi: Receiver hoặc Importer khác hủy; hash bằng 0; hủy lại lần hai; hủy lô chưa giao hoặc đã nhận; lô không tồn tại. Receiver cũ không xác nhận được lô đã bị hủy giao.</w:t>
+      </w:r>
+    </w:p>
+    <w:p>
+      <w:pPr>
+        <w:spacing w:after="120"/>
+      </w:pPr>
+      <w:r>
+        <w:rPr>
+          <w:b/>
+          <w:bCs/>
+        </w:rPr>
+        <w:t xml:space="preserve">Còn lại / việc tiếp theo:</w:t>
+      </w:r>
+    </w:p>
+    <w:p>
+      <w:pPr>
+        <w:pStyle w:val="ListParagraph"/>
+        <w:numPr>
+          <w:ilvl w:val="0"/>
+          <w:numId w:val="2"/>
+        </w:numPr>
+        <w:spacing w:after="60"/>
+      </w:pPr>
+      <w:r>
+        <w:t xml:space="preserve">DApp (T23): thêm nút Hủy giao cho Importer ở lô Đang vận chuyển; trang Truy xuất hiển thị lần hủy như một mốc.</w:t>
       </w:r>
     </w:p>
     <w:p>

</xml_diff>